<commit_message>
Add the corridor peak-hour analysis (step 20) and revise the report to 2.1
Corridor_peak_hour_2022 derives peak-hour factors from the survey's minute-level
departure times: the peak hour is 07:00-08:00 for every layer, holding 59-66 % of
the three-hour trips (1.8 x an average hour), with a sharp 07:30-07:45 quarter.
Car takes direction-level corridor factors (194 / 236 sampled trips); bus and
taxi-type take study-area factors because the corridor bus samples per direction
(48 / 26) give bootstrap ranges too wide to carry a design figure. The 2022 link
profiles are published in peak-departure-hour terms (busiest transit link ~980
per direction) with a sensitivity to the bus factor basis. METHODOLOGY 6r, README
and the task list follow; the Survey Matrices report gains section 7.3 and the
summary, glossary and caveats are updated.

Co-Authored-By: Claude Fable 5.1 <noreply@anthropic.com>
Claude-Session: https://claude.ai/code/session_01ARu29NbW8AYpZqV8kqXTdF
</commit_message>
<xml_diff>
--- a/reports/Survey_Matrices_Car_Bus_Rail_Report.docx
+++ b/reports/Survey_Matrices_Car_Bus_Rail_Report.docx
@@ -38,7 +38,7 @@
           <w:color w:val="52514E"/>
           <w:sz w:val="24"/>
         </w:rPr>
-        <w:t>Methodology, tests and results, in plain language — revision 2</w:t>
+        <w:t>Methodology, tests and results, in plain language — revision 2.1</w:t>
       </w:r>
     </w:p>
     <w:p>
@@ -50,7 +50,7 @@
           <w:i w:val="0"/>
           <w:sz w:val="20"/>
         </w:rPr>
-        <w:t>Date: 21 September 2026 (revision 1: 20 September 2026)</w:t>
+        <w:t>Date: 21 September 2026 (revision 1: 20 September 2026; revision 2.1 adds the peak-hour analysis, Part E section 7.3)</w:t>
       </w:r>
     </w:p>
     <w:p>
@@ -62,7 +62,7 @@
           <w:i w:val="0"/>
           <w:sz w:val="20"/>
         </w:rPr>
-        <w:t>Notebooks: THS_2017_cosine_GEH_tests, THS_2017_KS_tests, THS_2017_MSSIM_tests, Hybrid_superzone_conservation_test, THS_2017_two_mode_matrix, THS_2017_three_mode_2022, Corridor_flow_profile_survey_2022, Corridor_profile_hybrid_vs_ticketing</w:t>
+        <w:t>Notebooks: THS_2017_cosine_GEH_tests, THS_2017_KS_tests, THS_2017_MSSIM_tests, Hybrid_superzone_conservation_test, THS_2017_two_mode_matrix, THS_2017_three_mode_2022, Corridor_flow_profile_survey_2022, Corridor_profile_hybrid_vs_ticketing, Corridor_peak_hour_2022</w:t>
       </w:r>
     </w:p>
     <w:p>
@@ -109,7 +109,7 @@
         <w:rPr>
           <w:i w:val="0"/>
         </w:rPr>
-        <w:t>Four pieces of work are covered:</w:t>
+        <w:t>Five pieces of work are covered:</w:t>
       </w:r>
     </w:p>
     <w:p>
@@ -182,6 +182,23 @@
     </w:p>
     <w:p>
       <w:pPr>
+        <w:pStyle w:val="ListBullet"/>
+      </w:pPr>
+      <w:r>
+        <w:rPr>
+          <w:b/>
+        </w:rPr>
+        <w:t xml:space="preserve">Peak hour. </w:t>
+      </w:r>
+      <w:r>
+        <w:rPr>
+          <w:i w:val="0"/>
+        </w:rPr>
+        <w:t>Peak-hour factors from the survey's minute-level departure times, and the corridor profiles in peak-hour terms.</w:t>
+      </w:r>
+    </w:p>
+    <w:p>
+      <w:pPr>
         <w:pStyle w:val="Heading2"/>
       </w:pPr>
       <w:r>
@@ -585,6 +602,114 @@
                 <w:sz w:val="18"/>
               </w:rPr>
               <w:t>11.0 %</w:t>
+            </w:r>
+          </w:p>
+        </w:tc>
+      </w:tr>
+      <w:tr>
+        <w:tc>
+          <w:tcPr>
+            <w:tcW w:type="dxa" w:w="5386"/>
+          </w:tcPr>
+          <w:p>
+            <w:pPr>
+              <w:spacing w:after="20"/>
+            </w:pPr>
+            <w:r/>
+            <w:r>
+              <w:rPr>
+                <w:sz w:val="18"/>
+              </w:rPr>
+              <w:t>Peak hour (departures) and share of the three hours it holds</w:t>
+            </w:r>
+          </w:p>
+        </w:tc>
+        <w:tc>
+          <w:tcPr>
+            <w:tcW w:type="dxa" w:w="1701"/>
+          </w:tcPr>
+          <w:p>
+            <w:pPr>
+              <w:spacing w:after="20"/>
+              <w:jc w:val="right"/>
+            </w:pPr>
+            <w:r/>
+            <w:r>
+              <w:rPr>
+                <w:sz w:val="18"/>
+              </w:rPr>
+            </w:r>
+          </w:p>
+        </w:tc>
+        <w:tc>
+          <w:tcPr>
+            <w:tcW w:type="dxa" w:w="1701"/>
+          </w:tcPr>
+          <w:p>
+            <w:pPr>
+              <w:spacing w:after="20"/>
+              <w:jc w:val="right"/>
+            </w:pPr>
+            <w:r/>
+            <w:r>
+              <w:rPr>
+                <w:sz w:val="18"/>
+              </w:rPr>
+              <w:t>07:00–08:00; car 0.62, bus 0.59</w:t>
+            </w:r>
+          </w:p>
+        </w:tc>
+      </w:tr>
+      <w:tr>
+        <w:tc>
+          <w:tcPr>
+            <w:tcW w:type="dxa" w:w="5386"/>
+          </w:tcPr>
+          <w:p>
+            <w:pPr>
+              <w:spacing w:after="20"/>
+            </w:pPr>
+            <w:r/>
+            <w:r>
+              <w:rPr>
+                <w:sz w:val="18"/>
+              </w:rPr>
+              <w:t>Busiest transit link, peak hour (potential movements)</w:t>
+            </w:r>
+          </w:p>
+        </w:tc>
+        <w:tc>
+          <w:tcPr>
+            <w:tcW w:type="dxa" w:w="1701"/>
+          </w:tcPr>
+          <w:p>
+            <w:pPr>
+              <w:spacing w:after="20"/>
+              <w:jc w:val="right"/>
+            </w:pPr>
+            <w:r/>
+            <w:r>
+              <w:rPr>
+                <w:sz w:val="18"/>
+              </w:rPr>
+            </w:r>
+          </w:p>
+        </w:tc>
+        <w:tc>
+          <w:tcPr>
+            <w:tcW w:type="dxa" w:w="1701"/>
+          </w:tcPr>
+          <w:p>
+            <w:pPr>
+              <w:spacing w:after="20"/>
+              <w:jc w:val="right"/>
+            </w:pPr>
+            <w:r/>
+            <w:r>
+              <w:rPr>
+                <w:sz w:val="18"/>
+              </w:rPr>
+              <w:t>≈ 980 per direction</w:t>
             </w:r>
           </w:p>
         </w:tc>
@@ -703,6 +828,23 @@
           <w:i w:val="0"/>
         </w:rPr>
         <w:t>The peak link carries about 1,660 transit trips over three hours in each direction in the survey-based set. These are trips between line areas that could use the line, not passenger loads. Towards Tirat Carmel the ticketing-based profile is about twice as high; the difference is boarding-stop attribution and destination frame, not coverage.</w:t>
+      </w:r>
+    </w:p>
+    <w:p>
+      <w:pPr>
+        <w:pStyle w:val="ListBullet"/>
+      </w:pPr>
+      <w:r>
+        <w:rPr>
+          <w:b/>
+        </w:rPr>
+        <w:t xml:space="preserve">The peak hour is 07:00–08:00 and carries 1.8 times an average hour. </w:t>
+      </w:r>
+      <w:r>
+        <w:rPr>
+          <w:i w:val="0"/>
+        </w:rPr>
+        <w:t>Departure times in the survey put 59–66 % of the three-hour trips into the busiest 60 minutes, with a sharp quarter-hour peak at 07:30–07:45. In peak-hour terms the busiest transit link carries about 980 potential movements per direction (three-hour 1,650–1,660); all layers together 4,200–4,600. The bus factor is the study-area one because the corridor bus samples per direction are too thin (26–48 trips); taking the corridor values instead moves the busiest transit link by ± 15 %.</w:t>
       </w:r>
     </w:p>
     <w:p>
@@ -1320,6 +1462,23 @@
           <w:i w:val="0"/>
         </w:rPr>
         <w:t>Trips between two line areas, counted on every link between them as if they all used the line. A screening quantity, not a passenger load.</w:t>
+      </w:r>
+    </w:p>
+    <w:p>
+      <w:pPr>
+        <w:pStyle w:val="ListBullet"/>
+      </w:pPr>
+      <w:r>
+        <w:rPr>
+          <w:b/>
+        </w:rPr>
+        <w:t xml:space="preserve">Peak-hour factor. </w:t>
+      </w:r>
+      <w:r>
+        <w:rPr>
+          <w:i w:val="0"/>
+        </w:rPr>
+        <w:t>PHF₃ₕ is the share of the three-hour trips that depart in the busiest 60 minutes (an average hour would be 0.333). PHF₆₀ is the conventional within-hour factor: peak-hour trips divided by four times the busiest 15 minutes (1.0 = a flat hour).</w:t>
       </w:r>
     </w:p>
     <w:p>
@@ -10175,6 +10334,1132 @@
     </w:p>
     <w:p>
       <w:pPr>
+        <w:pStyle w:val="Heading2"/>
+      </w:pPr>
+      <w:r>
+        <w:t>7.3 The peak hour (new in revision 2.1)</w:t>
+      </w:r>
+    </w:p>
+    <w:p>
+      <w:r>
+        <w:rPr>
+          <w:i w:val="0"/>
+        </w:rPr>
+        <w:t>Everything above is a three-hour total. The survey records the departure time of every trip to the minute, so the busiest hour can be found directly. Trips were binned in 15-minute intervals over 06:00–09:00; the peak hour is the 60-minute window, in 15-minute steps, that holds the largest share of trips. Two factors describe it: the share of the three hours that falls in the peak hour (an average hour would be 0.333), and the conventional within-hour factor, peak-hour trips divided by four times the busiest quarter-hour (1.0 means a flat hour).</w:t>
+      </w:r>
+    </w:p>
+    <w:tbl>
+      <w:tblPr>
+        <w:tblStyle w:val="TableGrid"/>
+        <w:tblW w:type="auto" w:w="0"/>
+        <w:jc w:val="center"/>
+        <w:tblLook w:firstColumn="1" w:firstRow="1" w:lastColumn="0" w:lastRow="0" w:noHBand="0" w:noVBand="1" w:val="04A0"/>
+      </w:tblPr>
+      <w:tblGrid>
+        <w:gridCol w:w="1289"/>
+        <w:gridCol w:w="1289"/>
+        <w:gridCol w:w="1289"/>
+        <w:gridCol w:w="1289"/>
+        <w:gridCol w:w="1289"/>
+        <w:gridCol w:w="1289"/>
+        <w:gridCol w:w="1289"/>
+      </w:tblGrid>
+      <w:tr>
+        <w:tc>
+          <w:tcPr>
+            <w:tcW w:type="dxa" w:w="1247"/>
+            <w:shd w:val="clear" w:color="auto" w:fill="E8EEF6"/>
+          </w:tcPr>
+          <w:p>
+            <w:pPr>
+              <w:spacing w:after="20"/>
+            </w:pPr>
+            <w:r/>
+            <w:r>
+              <w:rPr>
+                <w:b/>
+                <w:sz w:val="16"/>
+              </w:rPr>
+              <w:t>Layer</w:t>
+            </w:r>
+          </w:p>
+        </w:tc>
+        <w:tc>
+          <w:tcPr>
+            <w:tcW w:type="dxa" w:w="1247"/>
+            <w:shd w:val="clear" w:color="auto" w:fill="E8EEF6"/>
+          </w:tcPr>
+          <w:p>
+            <w:pPr>
+              <w:spacing w:after="20"/>
+            </w:pPr>
+            <w:r/>
+            <w:r>
+              <w:rPr>
+                <w:b/>
+                <w:sz w:val="16"/>
+              </w:rPr>
+              <w:t>Peak hour</w:t>
+            </w:r>
+          </w:p>
+        </w:tc>
+        <w:tc>
+          <w:tcPr>
+            <w:tcW w:type="dxa" w:w="1361"/>
+            <w:shd w:val="clear" w:color="auto" w:fill="E8EEF6"/>
+          </w:tcPr>
+          <w:p>
+            <w:pPr>
+              <w:spacing w:after="20"/>
+            </w:pPr>
+            <w:r/>
+            <w:r>
+              <w:rPr>
+                <w:b/>
+                <w:sz w:val="16"/>
+              </w:rPr>
+              <w:t>Share of the 3 hours (study area)</w:t>
+            </w:r>
+          </w:p>
+        </w:tc>
+        <w:tc>
+          <w:tcPr>
+            <w:tcW w:type="dxa" w:w="1134"/>
+            <w:shd w:val="clear" w:color="auto" w:fill="E8EEF6"/>
+          </w:tcPr>
+          <w:p>
+            <w:pPr>
+              <w:spacing w:after="20"/>
+            </w:pPr>
+            <w:r/>
+            <w:r>
+              <w:rPr>
+                <w:b/>
+                <w:sz w:val="16"/>
+              </w:rPr>
+              <w:t>Within-hour factor</w:t>
+            </w:r>
+          </w:p>
+        </w:tc>
+        <w:tc>
+          <w:tcPr>
+            <w:tcW w:type="dxa" w:w="1474"/>
+            <w:shd w:val="clear" w:color="auto" w:fill="E8EEF6"/>
+          </w:tcPr>
+          <w:p>
+            <w:pPr>
+              <w:spacing w:after="20"/>
+            </w:pPr>
+            <w:r/>
+            <w:r>
+              <w:rPr>
+                <w:b/>
+                <w:sz w:val="16"/>
+              </w:rPr>
+              <w:t>Corridor, towards Nazareth (sampled trips)</w:t>
+            </w:r>
+          </w:p>
+        </w:tc>
+        <w:tc>
+          <w:tcPr>
+            <w:tcW w:type="dxa" w:w="1474"/>
+            <w:shd w:val="clear" w:color="auto" w:fill="E8EEF6"/>
+          </w:tcPr>
+          <w:p>
+            <w:pPr>
+              <w:spacing w:after="20"/>
+            </w:pPr>
+            <w:r/>
+            <w:r>
+              <w:rPr>
+                <w:b/>
+                <w:sz w:val="16"/>
+              </w:rPr>
+              <w:t>Corridor, towards Tirat Carmel (sampled trips)</w:t>
+            </w:r>
+          </w:p>
+        </w:tc>
+        <w:tc>
+          <w:tcPr>
+            <w:tcW w:type="dxa" w:w="1417"/>
+            <w:shd w:val="clear" w:color="auto" w:fill="E8EEF6"/>
+          </w:tcPr>
+          <w:p>
+            <w:pPr>
+              <w:spacing w:after="20"/>
+            </w:pPr>
+            <w:r/>
+            <w:r>
+              <w:rPr>
+                <w:b/>
+                <w:sz w:val="16"/>
+              </w:rPr>
+              <w:t>Factor applied</w:t>
+            </w:r>
+          </w:p>
+        </w:tc>
+      </w:tr>
+      <w:tr>
+        <w:tc>
+          <w:tcPr>
+            <w:tcW w:type="dxa" w:w="1247"/>
+          </w:tcPr>
+          <w:p>
+            <w:pPr>
+              <w:spacing w:after="20"/>
+            </w:pPr>
+            <w:r/>
+            <w:r>
+              <w:rPr>
+                <w:sz w:val="16"/>
+              </w:rPr>
+              <w:t>Car</w:t>
+            </w:r>
+          </w:p>
+        </w:tc>
+        <w:tc>
+          <w:tcPr>
+            <w:tcW w:type="dxa" w:w="1247"/>
+          </w:tcPr>
+          <w:p>
+            <w:pPr>
+              <w:spacing w:after="20"/>
+              <w:jc w:val="right"/>
+            </w:pPr>
+            <w:r/>
+            <w:r>
+              <w:rPr>
+                <w:sz w:val="16"/>
+              </w:rPr>
+              <w:t>07:00–08:00</w:t>
+            </w:r>
+          </w:p>
+        </w:tc>
+        <w:tc>
+          <w:tcPr>
+            <w:tcW w:type="dxa" w:w="1361"/>
+          </w:tcPr>
+          <w:p>
+            <w:pPr>
+              <w:spacing w:after="20"/>
+              <w:jc w:val="right"/>
+            </w:pPr>
+            <w:r/>
+            <w:r>
+              <w:rPr>
+                <w:sz w:val="16"/>
+              </w:rPr>
+              <w:t>0.62</w:t>
+            </w:r>
+          </w:p>
+        </w:tc>
+        <w:tc>
+          <w:tcPr>
+            <w:tcW w:type="dxa" w:w="1134"/>
+          </w:tcPr>
+          <w:p>
+            <w:pPr>
+              <w:spacing w:after="20"/>
+              <w:jc w:val="right"/>
+            </w:pPr>
+            <w:r/>
+            <w:r>
+              <w:rPr>
+                <w:sz w:val="16"/>
+              </w:rPr>
+              <w:t>0.69</w:t>
+            </w:r>
+          </w:p>
+        </w:tc>
+        <w:tc>
+          <w:tcPr>
+            <w:tcW w:type="dxa" w:w="1474"/>
+          </w:tcPr>
+          <w:p>
+            <w:pPr>
+              <w:spacing w:after="20"/>
+              <w:jc w:val="right"/>
+            </w:pPr>
+            <w:r/>
+            <w:r>
+              <w:rPr>
+                <w:sz w:val="16"/>
+              </w:rPr>
+              <w:t>0.66 (194)</w:t>
+            </w:r>
+          </w:p>
+        </w:tc>
+        <w:tc>
+          <w:tcPr>
+            <w:tcW w:type="dxa" w:w="1474"/>
+          </w:tcPr>
+          <w:p>
+            <w:pPr>
+              <w:spacing w:after="20"/>
+              <w:jc w:val="right"/>
+            </w:pPr>
+            <w:r/>
+            <w:r>
+              <w:rPr>
+                <w:sz w:val="16"/>
+              </w:rPr>
+              <w:t>0.63 (236)</w:t>
+            </w:r>
+          </w:p>
+        </w:tc>
+        <w:tc>
+          <w:tcPr>
+            <w:tcW w:type="dxa" w:w="1417"/>
+          </w:tcPr>
+          <w:p>
+            <w:pPr>
+              <w:spacing w:after="20"/>
+              <w:jc w:val="right"/>
+            </w:pPr>
+            <w:r/>
+            <w:r>
+              <w:rPr>
+                <w:sz w:val="16"/>
+              </w:rPr>
+              <w:t>corridor, by direction</w:t>
+            </w:r>
+          </w:p>
+        </w:tc>
+      </w:tr>
+      <w:tr>
+        <w:tc>
+          <w:tcPr>
+            <w:tcW w:type="dxa" w:w="1247"/>
+          </w:tcPr>
+          <w:p>
+            <w:pPr>
+              <w:spacing w:after="20"/>
+            </w:pPr>
+            <w:r/>
+            <w:r>
+              <w:rPr>
+                <w:sz w:val="16"/>
+              </w:rPr>
+              <w:t>Bus</w:t>
+            </w:r>
+          </w:p>
+        </w:tc>
+        <w:tc>
+          <w:tcPr>
+            <w:tcW w:type="dxa" w:w="1247"/>
+          </w:tcPr>
+          <w:p>
+            <w:pPr>
+              <w:spacing w:after="20"/>
+              <w:jc w:val="right"/>
+            </w:pPr>
+            <w:r/>
+            <w:r>
+              <w:rPr>
+                <w:sz w:val="16"/>
+              </w:rPr>
+              <w:t>07:00–08:00</w:t>
+            </w:r>
+          </w:p>
+        </w:tc>
+        <w:tc>
+          <w:tcPr>
+            <w:tcW w:type="dxa" w:w="1361"/>
+          </w:tcPr>
+          <w:p>
+            <w:pPr>
+              <w:spacing w:after="20"/>
+              <w:jc w:val="right"/>
+            </w:pPr>
+            <w:r/>
+            <w:r>
+              <w:rPr>
+                <w:sz w:val="16"/>
+              </w:rPr>
+              <w:t>0.59</w:t>
+            </w:r>
+          </w:p>
+        </w:tc>
+        <w:tc>
+          <w:tcPr>
+            <w:tcW w:type="dxa" w:w="1134"/>
+          </w:tcPr>
+          <w:p>
+            <w:pPr>
+              <w:spacing w:after="20"/>
+              <w:jc w:val="right"/>
+            </w:pPr>
+            <w:r/>
+            <w:r>
+              <w:rPr>
+                <w:sz w:val="16"/>
+              </w:rPr>
+              <w:t>0.75</w:t>
+            </w:r>
+          </w:p>
+        </w:tc>
+        <w:tc>
+          <w:tcPr>
+            <w:tcW w:type="dxa" w:w="1474"/>
+          </w:tcPr>
+          <w:p>
+            <w:pPr>
+              <w:spacing w:after="20"/>
+              <w:jc w:val="right"/>
+            </w:pPr>
+            <w:r/>
+            <w:r>
+              <w:rPr>
+                <w:sz w:val="16"/>
+              </w:rPr>
+              <w:t>0.66 (48)</w:t>
+            </w:r>
+          </w:p>
+        </w:tc>
+        <w:tc>
+          <w:tcPr>
+            <w:tcW w:type="dxa" w:w="1474"/>
+          </w:tcPr>
+          <w:p>
+            <w:pPr>
+              <w:spacing w:after="20"/>
+              <w:jc w:val="right"/>
+            </w:pPr>
+            <w:r/>
+            <w:r>
+              <w:rPr>
+                <w:sz w:val="16"/>
+              </w:rPr>
+              <w:t>0.44 (26)</w:t>
+            </w:r>
+          </w:p>
+        </w:tc>
+        <w:tc>
+          <w:tcPr>
+            <w:tcW w:type="dxa" w:w="1417"/>
+          </w:tcPr>
+          <w:p>
+            <w:pPr>
+              <w:spacing w:after="20"/>
+              <w:jc w:val="right"/>
+            </w:pPr>
+            <w:r/>
+            <w:r>
+              <w:rPr>
+                <w:sz w:val="16"/>
+              </w:rPr>
+              <w:t>study area, 0.59</w:t>
+            </w:r>
+          </w:p>
+        </w:tc>
+      </w:tr>
+      <w:tr>
+        <w:tc>
+          <w:tcPr>
+            <w:tcW w:type="dxa" w:w="1247"/>
+          </w:tcPr>
+          <w:p>
+            <w:pPr>
+              <w:spacing w:after="20"/>
+            </w:pPr>
+            <w:r/>
+            <w:r>
+              <w:rPr>
+                <w:sz w:val="16"/>
+              </w:rPr>
+              <w:t>Taxi-type</w:t>
+            </w:r>
+          </w:p>
+        </w:tc>
+        <w:tc>
+          <w:tcPr>
+            <w:tcW w:type="dxa" w:w="1247"/>
+          </w:tcPr>
+          <w:p>
+            <w:pPr>
+              <w:spacing w:after="20"/>
+              <w:jc w:val="right"/>
+            </w:pPr>
+            <w:r/>
+            <w:r>
+              <w:rPr>
+                <w:sz w:val="16"/>
+              </w:rPr>
+              <w:t>07:00–08:00</w:t>
+            </w:r>
+          </w:p>
+        </w:tc>
+        <w:tc>
+          <w:tcPr>
+            <w:tcW w:type="dxa" w:w="1361"/>
+          </w:tcPr>
+          <w:p>
+            <w:pPr>
+              <w:spacing w:after="20"/>
+              <w:jc w:val="right"/>
+            </w:pPr>
+            <w:r/>
+            <w:r>
+              <w:rPr>
+                <w:sz w:val="16"/>
+              </w:rPr>
+              <w:t>0.58</w:t>
+            </w:r>
+          </w:p>
+        </w:tc>
+        <w:tc>
+          <w:tcPr>
+            <w:tcW w:type="dxa" w:w="1134"/>
+          </w:tcPr>
+          <w:p>
+            <w:pPr>
+              <w:spacing w:after="20"/>
+              <w:jc w:val="right"/>
+            </w:pPr>
+            <w:r/>
+            <w:r>
+              <w:rPr>
+                <w:sz w:val="16"/>
+              </w:rPr>
+              <w:t>0.68</w:t>
+            </w:r>
+          </w:p>
+        </w:tc>
+        <w:tc>
+          <w:tcPr>
+            <w:tcW w:type="dxa" w:w="1474"/>
+          </w:tcPr>
+          <w:p>
+            <w:pPr>
+              <w:spacing w:after="20"/>
+              <w:jc w:val="right"/>
+            </w:pPr>
+            <w:r/>
+            <w:r>
+              <w:rPr>
+                <w:sz w:val="16"/>
+              </w:rPr>
+              <w:t>0.78 (35)</w:t>
+            </w:r>
+          </w:p>
+        </w:tc>
+        <w:tc>
+          <w:tcPr>
+            <w:tcW w:type="dxa" w:w="1474"/>
+          </w:tcPr>
+          <w:p>
+            <w:pPr>
+              <w:spacing w:after="20"/>
+              <w:jc w:val="right"/>
+            </w:pPr>
+            <w:r/>
+            <w:r>
+              <w:rPr>
+                <w:sz w:val="16"/>
+              </w:rPr>
+              <w:t>0.84 (25)</w:t>
+            </w:r>
+          </w:p>
+        </w:tc>
+        <w:tc>
+          <w:tcPr>
+            <w:tcW w:type="dxa" w:w="1417"/>
+          </w:tcPr>
+          <w:p>
+            <w:pPr>
+              <w:spacing w:after="20"/>
+              <w:jc w:val="right"/>
+            </w:pPr>
+            <w:r/>
+            <w:r>
+              <w:rPr>
+                <w:sz w:val="16"/>
+              </w:rPr>
+              <w:t>study area, 0.58</w:t>
+            </w:r>
+          </w:p>
+        </w:tc>
+      </w:tr>
+      <w:tr>
+        <w:tc>
+          <w:tcPr>
+            <w:tcW w:type="dxa" w:w="1247"/>
+          </w:tcPr>
+          <w:p>
+            <w:pPr>
+              <w:spacing w:after="20"/>
+            </w:pPr>
+            <w:r/>
+            <w:r>
+              <w:rPr>
+                <w:sz w:val="16"/>
+              </w:rPr>
+              <w:t>Walk / other</w:t>
+            </w:r>
+          </w:p>
+        </w:tc>
+        <w:tc>
+          <w:tcPr>
+            <w:tcW w:type="dxa" w:w="1247"/>
+          </w:tcPr>
+          <w:p>
+            <w:pPr>
+              <w:spacing w:after="20"/>
+              <w:jc w:val="right"/>
+            </w:pPr>
+            <w:r/>
+            <w:r>
+              <w:rPr>
+                <w:sz w:val="16"/>
+              </w:rPr>
+              <w:t>07:00–08:00</w:t>
+            </w:r>
+          </w:p>
+        </w:tc>
+        <w:tc>
+          <w:tcPr>
+            <w:tcW w:type="dxa" w:w="1361"/>
+          </w:tcPr>
+          <w:p>
+            <w:pPr>
+              <w:spacing w:after="20"/>
+              <w:jc w:val="right"/>
+            </w:pPr>
+            <w:r/>
+            <w:r>
+              <w:rPr>
+                <w:sz w:val="16"/>
+              </w:rPr>
+              <w:t>0.79</w:t>
+            </w:r>
+          </w:p>
+        </w:tc>
+        <w:tc>
+          <w:tcPr>
+            <w:tcW w:type="dxa" w:w="1134"/>
+          </w:tcPr>
+          <w:p>
+            <w:pPr>
+              <w:spacing w:after="20"/>
+              <w:jc w:val="right"/>
+            </w:pPr>
+            <w:r/>
+            <w:r>
+              <w:rPr>
+                <w:sz w:val="16"/>
+              </w:rPr>
+              <w:t>0.64</w:t>
+            </w:r>
+          </w:p>
+        </w:tc>
+        <w:tc>
+          <w:tcPr>
+            <w:tcW w:type="dxa" w:w="1474"/>
+          </w:tcPr>
+          <w:p>
+            <w:pPr>
+              <w:spacing w:after="20"/>
+              <w:jc w:val="right"/>
+            </w:pPr>
+            <w:r/>
+            <w:r>
+              <w:rPr>
+                <w:sz w:val="16"/>
+              </w:rPr>
+              <w:t>—</w:t>
+            </w:r>
+          </w:p>
+        </w:tc>
+        <w:tc>
+          <w:tcPr>
+            <w:tcW w:type="dxa" w:w="1474"/>
+          </w:tcPr>
+          <w:p>
+            <w:pPr>
+              <w:spacing w:after="20"/>
+              <w:jc w:val="right"/>
+            </w:pPr>
+            <w:r/>
+            <w:r>
+              <w:rPr>
+                <w:sz w:val="16"/>
+              </w:rPr>
+              <w:t>—</w:t>
+            </w:r>
+          </w:p>
+        </w:tc>
+        <w:tc>
+          <w:tcPr>
+            <w:tcW w:type="dxa" w:w="1417"/>
+          </w:tcPr>
+          <w:p>
+            <w:pPr>
+              <w:spacing w:after="20"/>
+              <w:jc w:val="right"/>
+            </w:pPr>
+            <w:r/>
+            <w:r>
+              <w:rPr>
+                <w:sz w:val="16"/>
+              </w:rPr>
+              <w:t>not in the profile</w:t>
+            </w:r>
+          </w:p>
+        </w:tc>
+      </w:tr>
+    </w:tbl>
+    <w:p>
+      <w:pPr>
+        <w:spacing w:after="40"/>
+      </w:pPr>
+    </w:p>
+    <w:p>
+      <w:r>
+        <w:rPr>
+          <w:i/>
+          <w:color w:val="52514E"/>
+          <w:sz w:val="18"/>
+        </w:rPr>
+        <w:t>Peak-hour factors from survey departure times. Household-bootstrap ranges (5th–95th percentile) for the corridor car factors are 0.51–0.81 and 0.47–0.75; for the corridor bus factors 0.54–0.84 and 0.43–0.79.</w:t>
+      </w:r>
+    </w:p>
+    <w:p>
+      <w:r>
+        <w:rPr>
+          <w:i w:val="0"/>
+        </w:rPr>
+        <w:t>The peak hour is the same everywhere: 07:00–08:00, with corridor car trips towards Nazareth a quarter-hour later (07:15–08:15) and a third of them still departing after 08:00. It carries about 1.8 times an average hour, and inside it the 07:30–07:45 quarter alone holds a fifth of car departures. Bus departures are slightly less peaked than car, taxi-type less again.</w:t>
+      </w:r>
+    </w:p>
+    <w:p>
+      <w:r>
+        <w:rPr>
+          <w:i w:val="0"/>
+        </w:rPr>
+        <w:t>Which factor to apply is a question of sample size. The corridor car trips are numerous enough (about 200 per direction) for a factor per direction. The corridor bus trips are not: 48 and 26 sampled trips give factors of 0.66 and 0.44 whose bootstrap ranges overlap almost entirely, so the bus and taxi-type layers take the study-area factors (0.59 and 0.58, on 1,636 and 253 trips) and rail takes the bus factor. A finer split, one factor per link, is not supported either: only 19 link-directions, all car, reach 30 sampled trips, and on them the per-link factor scatters from 0.12 below to 0.19 above the direction factor. One factor per direction and layer is what the survey can carry.</w:t>
+      </w:r>
+    </w:p>
+    <w:tbl>
+      <w:tblPr>
+        <w:tblStyle w:val="TableGrid"/>
+        <w:tblW w:type="auto" w:w="0"/>
+        <w:jc w:val="center"/>
+        <w:tblLook w:firstColumn="1" w:firstRow="1" w:lastColumn="0" w:lastRow="0" w:noHBand="0" w:noVBand="1" w:val="04A0"/>
+      </w:tblPr>
+      <w:tblGrid>
+        <w:gridCol w:w="3009"/>
+        <w:gridCol w:w="3009"/>
+        <w:gridCol w:w="3009"/>
+      </w:tblGrid>
+      <w:tr>
+        <w:tc>
+          <w:tcPr>
+            <w:tcW w:type="dxa" w:w="4252"/>
+            <w:shd w:val="clear" w:color="auto" w:fill="E8EEF6"/>
+          </w:tcPr>
+          <w:p>
+            <w:pPr>
+              <w:spacing w:after="20"/>
+            </w:pPr>
+            <w:r/>
+            <w:r>
+              <w:rPr>
+                <w:b/>
+                <w:sz w:val="18"/>
+              </w:rPr>
+              <w:t>Busiest link, peak hour</w:t>
+            </w:r>
+          </w:p>
+        </w:tc>
+        <w:tc>
+          <w:tcPr>
+            <w:tcW w:type="dxa" w:w="2268"/>
+            <w:shd w:val="clear" w:color="auto" w:fill="E8EEF6"/>
+          </w:tcPr>
+          <w:p>
+            <w:pPr>
+              <w:spacing w:after="20"/>
+            </w:pPr>
+            <w:r/>
+            <w:r>
+              <w:rPr>
+                <w:b/>
+                <w:sz w:val="18"/>
+              </w:rPr>
+              <w:t>Towards Nazareth</w:t>
+            </w:r>
+          </w:p>
+        </w:tc>
+        <w:tc>
+          <w:tcPr>
+            <w:tcW w:type="dxa" w:w="2268"/>
+            <w:shd w:val="clear" w:color="auto" w:fill="E8EEF6"/>
+          </w:tcPr>
+          <w:p>
+            <w:pPr>
+              <w:spacing w:after="20"/>
+            </w:pPr>
+            <w:r/>
+            <w:r>
+              <w:rPr>
+                <w:b/>
+                <w:sz w:val="18"/>
+              </w:rPr>
+              <w:t>Towards Tirat Carmel</w:t>
+            </w:r>
+          </w:p>
+        </w:tc>
+      </w:tr>
+      <w:tr>
+        <w:tc>
+          <w:tcPr>
+            <w:tcW w:type="dxa" w:w="4252"/>
+          </w:tcPr>
+          <w:p>
+            <w:pPr>
+              <w:spacing w:after="20"/>
+            </w:pPr>
+            <w:r/>
+            <w:r>
+              <w:rPr>
+                <w:sz w:val="18"/>
+              </w:rPr>
+              <w:t>Transit (bus + rail): link</w:t>
+            </w:r>
+          </w:p>
+        </w:tc>
+        <w:tc>
+          <w:tcPr>
+            <w:tcW w:type="dxa" w:w="2268"/>
+          </w:tcPr>
+          <w:p>
+            <w:pPr>
+              <w:spacing w:after="20"/>
+              <w:jc w:val="right"/>
+            </w:pPr>
+            <w:r/>
+            <w:r>
+              <w:rPr>
+                <w:sz w:val="18"/>
+              </w:rPr>
+              <w:t>Ein Hayam – Bat Galim</w:t>
+            </w:r>
+          </w:p>
+        </w:tc>
+        <w:tc>
+          <w:tcPr>
+            <w:tcW w:type="dxa" w:w="2268"/>
+          </w:tcPr>
+          <w:p>
+            <w:pPr>
+              <w:spacing w:after="20"/>
+              <w:jc w:val="right"/>
+            </w:pPr>
+            <w:r/>
+            <w:r>
+              <w:rPr>
+                <w:sz w:val="18"/>
+              </w:rPr>
+              <w:t>Neot Peres – Neve David</w:t>
+            </w:r>
+          </w:p>
+        </w:tc>
+      </w:tr>
+      <w:tr>
+        <w:tc>
+          <w:tcPr>
+            <w:tcW w:type="dxa" w:w="4252"/>
+          </w:tcPr>
+          <w:p>
+            <w:pPr>
+              <w:spacing w:after="20"/>
+            </w:pPr>
+            <w:r/>
+            <w:r>
+              <w:rPr>
+                <w:sz w:val="18"/>
+              </w:rPr>
+              <w:t>Transit: three-hour / average hour / peak hour</w:t>
+            </w:r>
+          </w:p>
+        </w:tc>
+        <w:tc>
+          <w:tcPr>
+            <w:tcW w:type="dxa" w:w="2268"/>
+          </w:tcPr>
+          <w:p>
+            <w:pPr>
+              <w:spacing w:after="20"/>
+              <w:jc w:val="right"/>
+            </w:pPr>
+            <w:r/>
+            <w:r>
+              <w:rPr>
+                <w:sz w:val="18"/>
+              </w:rPr>
+              <w:t>1,661 / 554 / 981</w:t>
+            </w:r>
+          </w:p>
+        </w:tc>
+        <w:tc>
+          <w:tcPr>
+            <w:tcW w:type="dxa" w:w="2268"/>
+          </w:tcPr>
+          <w:p>
+            <w:pPr>
+              <w:spacing w:after="20"/>
+              <w:jc w:val="right"/>
+            </w:pPr>
+            <w:r/>
+            <w:r>
+              <w:rPr>
+                <w:sz w:val="18"/>
+              </w:rPr>
+              <w:t>1,650 / 550 / 974</w:t>
+            </w:r>
+          </w:p>
+        </w:tc>
+      </w:tr>
+      <w:tr>
+        <w:tc>
+          <w:tcPr>
+            <w:tcW w:type="dxa" w:w="4252"/>
+          </w:tcPr>
+          <w:p>
+            <w:pPr>
+              <w:spacing w:after="20"/>
+            </w:pPr>
+            <w:r/>
+            <w:r>
+              <w:rPr>
+                <w:sz w:val="18"/>
+              </w:rPr>
+              <w:t>Transit peak hour if the bus factor were the corridor pooled / corridor direction value</w:t>
+            </w:r>
+          </w:p>
+        </w:tc>
+        <w:tc>
+          <w:tcPr>
+            <w:tcW w:type="dxa" w:w="2268"/>
+          </w:tcPr>
+          <w:p>
+            <w:pPr>
+              <w:spacing w:after="20"/>
+              <w:jc w:val="right"/>
+            </w:pPr>
+            <w:r/>
+            <w:r>
+              <w:rPr>
+                <w:sz w:val="18"/>
+              </w:rPr>
+              <w:t>835 / 1,089</w:t>
+            </w:r>
+          </w:p>
+        </w:tc>
+        <w:tc>
+          <w:tcPr>
+            <w:tcW w:type="dxa" w:w="2268"/>
+          </w:tcPr>
+          <w:p>
+            <w:pPr>
+              <w:spacing w:after="20"/>
+              <w:jc w:val="right"/>
+            </w:pPr>
+            <w:r/>
+            <w:r>
+              <w:rPr>
+                <w:sz w:val="18"/>
+              </w:rPr>
+              <w:t>829 / 718</w:t>
+            </w:r>
+          </w:p>
+        </w:tc>
+      </w:tr>
+      <w:tr>
+        <w:tc>
+          <w:tcPr>
+            <w:tcW w:type="dxa" w:w="4252"/>
+          </w:tcPr>
+          <w:p>
+            <w:pPr>
+              <w:spacing w:after="20"/>
+            </w:pPr>
+            <w:r/>
+            <w:r>
+              <w:rPr>
+                <w:sz w:val="18"/>
+              </w:rPr>
+              <w:t>All layers: link</w:t>
+            </w:r>
+          </w:p>
+        </w:tc>
+        <w:tc>
+          <w:tcPr>
+            <w:tcW w:type="dxa" w:w="2268"/>
+          </w:tcPr>
+          <w:p>
+            <w:pPr>
+              <w:spacing w:after="20"/>
+              <w:jc w:val="right"/>
+            </w:pPr>
+            <w:r/>
+            <w:r>
+              <w:rPr>
+                <w:sz w:val="18"/>
+              </w:rPr>
+              <w:t>Ein Hayam – Bat Galim</w:t>
+            </w:r>
+          </w:p>
+        </w:tc>
+        <w:tc>
+          <w:tcPr>
+            <w:tcW w:type="dxa" w:w="2268"/>
+          </w:tcPr>
+          <w:p>
+            <w:pPr>
+              <w:spacing w:after="20"/>
+              <w:jc w:val="right"/>
+            </w:pPr>
+            <w:r/>
+            <w:r>
+              <w:rPr>
+                <w:sz w:val="18"/>
+              </w:rPr>
+              <w:t>Bat Galim – Kiryat Eliezer</w:t>
+            </w:r>
+          </w:p>
+        </w:tc>
+      </w:tr>
+      <w:tr>
+        <w:tc>
+          <w:tcPr>
+            <w:tcW w:type="dxa" w:w="4252"/>
+          </w:tcPr>
+          <w:p>
+            <w:pPr>
+              <w:spacing w:after="20"/>
+            </w:pPr>
+            <w:r/>
+            <w:r>
+              <w:rPr>
+                <w:sz w:val="18"/>
+              </w:rPr>
+              <w:t>All layers: three-hour / peak hour</w:t>
+            </w:r>
+          </w:p>
+        </w:tc>
+        <w:tc>
+          <w:tcPr>
+            <w:tcW w:type="dxa" w:w="2268"/>
+          </w:tcPr>
+          <w:p>
+            <w:pPr>
+              <w:spacing w:after="20"/>
+              <w:jc w:val="right"/>
+            </w:pPr>
+            <w:r/>
+            <w:r>
+              <w:rPr>
+                <w:sz w:val="18"/>
+              </w:rPr>
+              <w:t>7,326 / 4,609</w:t>
+            </w:r>
+          </w:p>
+        </w:tc>
+        <w:tc>
+          <w:tcPr>
+            <w:tcW w:type="dxa" w:w="2268"/>
+          </w:tcPr>
+          <w:p>
+            <w:pPr>
+              <w:spacing w:after="20"/>
+              <w:jc w:val="right"/>
+            </w:pPr>
+            <w:r/>
+            <w:r>
+              <w:rPr>
+                <w:sz w:val="18"/>
+              </w:rPr>
+              <w:t>6,847 / 4,205</w:t>
+            </w:r>
+          </w:p>
+        </w:tc>
+      </w:tr>
+    </w:tbl>
+    <w:p>
+      <w:pPr>
+        <w:spacing w:after="40"/>
+      </w:pPr>
+    </w:p>
+    <w:p>
+      <w:r>
+        <w:rPr>
+          <w:i/>
+          <w:color w:val="52514E"/>
+          <w:sz w:val="18"/>
+        </w:rPr>
+        <w:t>Peak-hour potential movements on the busiest links, 2022 layers. Full link tables in corridor_link_flows_peak_hour_2022.csv.</w:t>
+      </w:r>
+    </w:p>
+    <w:p>
+      <w:pPr>
+        <w:jc w:val="center"/>
+      </w:pPr>
+      <w:r>
+        <w:drawing>
+          <wp:inline xmlns:a="http://schemas.openxmlformats.org/drawingml/2006/main" xmlns:pic="http://schemas.openxmlformats.org/drawingml/2006/picture">
+            <wp:extent cx="5724000" cy="4171772"/>
+            <wp:docPr id="10" name="Picture 10"/>
+            <wp:cNvGraphicFramePr>
+              <a:graphicFrameLocks noChangeAspect="1"/>
+            </wp:cNvGraphicFramePr>
+            <a:graphic>
+              <a:graphicData uri="http://schemas.openxmlformats.org/drawingml/2006/picture">
+                <pic:pic>
+                  <pic:nvPicPr>
+                    <pic:cNvPr id="0" name="corridor_flow_profile_peak_hour_2022.png"/>
+                    <pic:cNvPicPr/>
+                  </pic:nvPicPr>
+                  <pic:blipFill>
+                    <a:blip r:embed="rId18"/>
+                    <a:stretch>
+                      <a:fillRect/>
+                    </a:stretch>
+                  </pic:blipFill>
+                  <pic:spPr>
+                    <a:xfrm>
+                      <a:off x="0" y="0"/>
+                      <a:ext cx="5724000" cy="4171772"/>
+                    </a:xfrm>
+                    <a:prstGeom prst="rect"/>
+                  </pic:spPr>
+                </pic:pic>
+              </a:graphicData>
+            </a:graphic>
+          </wp:inline>
+        </w:drawing>
+      </w:r>
+    </w:p>
+    <w:p>
+      <w:r>
+        <w:rPr>
+          <w:i/>
+          <w:color w:val="52514E"/>
+          <w:sz w:val="18"/>
+        </w:rPr>
+        <w:t>Figure 10. Top: departure-time profiles of the line-area trips by direction and layer (applied profiles bold; shaded, the bus peak hour). Bottom: peak-hour transit potential movements along the line, with the average hour dashed.</w:t>
+      </w:r>
+    </w:p>
+    <w:p>
+      <w:r>
+        <w:rPr>
+          <w:i w:val="0"/>
+        </w:rPr>
+        <w:t>What to conclude. First, an average-hour reading of the three-hour profiles understates the design hour by 45 %; any capacity or frequency reasoning should start from the peak-hour values. Second, the peak-hour transit figures on the Haifa segment, roughly 1,000 potential movements per direction in the busiest hour, are the size of the market between line areas, not a load: they still contain travellers who cannot reach a station conveniently, who would keep a parallel bus, or whose trip crosses the link outside the departure hour. Third, the timing uncertainty is modest next to the volume uncertainty: the bus factor basis moves the busiest link by about 15 %, while the coverage threshold and the frame question of Part C move the bus volumes themselves by similar or larger amounts. Fourth, an independent check exists and should be run when the ticketing files are at hand: RavKav records the boarding hour, so the bus peak factor can be measured directly rather than taken from 1,636 survey trips.</w:t>
+      </w:r>
+    </w:p>
+    <w:p>
+      <w:pPr>
         <w:pStyle w:val="Heading1"/>
       </w:pPr>
       <w:r>
@@ -10280,7 +11565,7 @@
         <w:rPr>
           <w:i w:val="0"/>
         </w:rPr>
-        <w:t>Three-hour totals between line areas, without station access, route choice, peaking or off-line trips. Peak loads and capacity need a service-response model.</w:t>
+        <w:t>Three-hour totals and peak-departure-hour values between line areas, without station access, route choice or off-line trips. Peak loads and capacity need a service-response model; the peak-hour factors come from survey departure times, with the bus factor taken study-area-wide for lack of corridor sample.</w:t>
       </w:r>
     </w:p>
     <w:p>
@@ -10837,6 +12122,59 @@
           </w:p>
         </w:tc>
       </w:tr>
+      <w:tr>
+        <w:tc>
+          <w:tcPr>
+            <w:tcW w:type="dxa" w:w="2608"/>
+          </w:tcPr>
+          <w:p>
+            <w:pPr>
+              <w:spacing w:after="20"/>
+            </w:pPr>
+            <w:r/>
+            <w:r>
+              <w:rPr>
+                <w:sz w:val="17"/>
+              </w:rPr>
+              <w:t>Corridor_peak_hour_2022.ipynb</w:t>
+            </w:r>
+          </w:p>
+        </w:tc>
+        <w:tc>
+          <w:tcPr>
+            <w:tcW w:type="dxa" w:w="2948"/>
+          </w:tcPr>
+          <w:p>
+            <w:pPr>
+              <w:spacing w:after="20"/>
+            </w:pPr>
+            <w:r/>
+            <w:r>
+              <w:rPr>
+                <w:sz w:val="17"/>
+              </w:rPr>
+              <w:t>Peak-hour factors from survey departure times; peak-hour link profiles; bootstrap and sensitivity</w:t>
+            </w:r>
+          </w:p>
+        </w:tc>
+        <w:tc>
+          <w:tcPr>
+            <w:tcW w:type="dxa" w:w="3458"/>
+          </w:tcPr>
+          <w:p>
+            <w:pPr>
+              <w:spacing w:after="20"/>
+            </w:pPr>
+            <w:r/>
+            <w:r>
+              <w:rPr>
+                <w:sz w:val="17"/>
+              </w:rPr>
+              <w:t>peak_hour_factors*.csv, corridor_link_flows_peak_hour_2022.csv, peak_hour_sensitivity.csv</w:t>
+            </w:r>
+          </w:p>
+        </w:tc>
+      </w:tr>
     </w:tbl>
     <w:p>
       <w:pPr>
@@ -10848,7 +12186,7 @@
         <w:rPr>
           <w:i w:val="0"/>
         </w:rPr>
-        <w:t>Full method details, with every number, are in METHODOLOGY.md sections 6j to 6q of the repository; section 0 there lists every published file with its base, geography, modes, vintage and status.</w:t>
+        <w:t>Full method details, with every number, are in METHODOLOGY.md sections 6j to 6r of the repository; section 0 there lists every published file with its base, geography, modes, vintage and status.</w:t>
       </w:r>
     </w:p>
     <w:sectPr>

</xml_diff>

<commit_message>
PCA within the survey: car vs transit destination structure (step 21)
THS_2017_PCA_car_vs_transit applies the PCA test suite with the mode group as
the grouping. At superzone level car and transit share the dominant structure
(overlap 0.75, 0.83 on the 26 well-sampled origins against a transit day-to-day
repeatability of 0.86; car components capture 86 % of the transit variance);
the divergence is systematic rather than diagonal: transit is less local
(self-containment 0.45 vs 0.62) and shifts share to the Haifa core (sign-flip
p = 0.04). METHODOLOGY 6s, README and the report (section 4.7) follow.

Co-Authored-By: Claude Fable 5.1 <noreply@anthropic.com>
Claude-Session: https://claude.ai/code/session_01ARu29NbW8AYpZqV8kqXTdF
</commit_message>
<xml_diff>
--- a/reports/Survey_Matrices_Car_Bus_Rail_Report.docx
+++ b/reports/Survey_Matrices_Car_Bus_Rail_Report.docx
@@ -50,7 +50,7 @@
           <w:i w:val="0"/>
           <w:sz w:val="20"/>
         </w:rPr>
-        <w:t>Date: 21 September 2026 (revision 1: 20 September 2026; revision 2.1 adds the peak-hour analysis, Part E section 7.3)</w:t>
+        <w:t>Date: 21 September 2026 (revision 1: 20 September 2026; revision 2.1 adds the peak-hour analysis, Part E section 7.3, and the car-versus-transit PCA, section 4.7)</w:t>
       </w:r>
     </w:p>
     <w:p>
@@ -62,7 +62,7 @@
           <w:i w:val="0"/>
           <w:sz w:val="20"/>
         </w:rPr>
-        <w:t>Notebooks: THS_2017_cosine_GEH_tests, THS_2017_KS_tests, THS_2017_MSSIM_tests, Hybrid_superzone_conservation_test, THS_2017_two_mode_matrix, THS_2017_three_mode_2022, Corridor_flow_profile_survey_2022, Corridor_profile_hybrid_vs_ticketing, Corridor_peak_hour_2022</w:t>
+        <w:t>Notebooks: THS_2017_cosine_GEH_tests, THS_2017_KS_tests, THS_2017_MSSIM_tests, Hybrid_superzone_conservation_test, THS_2017_two_mode_matrix, THS_2017_three_mode_2022, Corridor_flow_profile_survey_2022, Corridor_profile_hybrid_vs_ticketing, Corridor_peak_hour_2022, THS_2017_PCA_car_vs_transit</w:t>
       </w:r>
     </w:p>
     <w:p>
@@ -5006,6 +5006,738 @@
     </w:p>
     <w:p>
       <w:pPr>
+        <w:pStyle w:val="Heading2"/>
+      </w:pPr>
+      <w:r>
+        <w:t>4.7 Car versus transit inside the survey (new in revision 2.1)</w:t>
+      </w:r>
+    </w:p>
+    <w:p>
+      <w:r>
+        <w:rPr>
+          <w:i w:val="0"/>
+        </w:rPr>
+        <w:t>The same principal-component tests were run within the survey, with the mode group as the grouping: do car trips and transit trips (bus, taxi-type and rail) share the same destination-choice structure? Each statistic is judged against each mode's own day-to-day repeatability and a permuted-geography null; transit rows are thin (median 36 sampled trips per origin superzone over two days), so a household bootstrap and a run restricted to the 26 well-sampled origins accompany the headline figures.</w:t>
+      </w:r>
+    </w:p>
+    <w:tbl>
+      <w:tblPr>
+        <w:tblStyle w:val="TableGrid"/>
+        <w:tblW w:type="auto" w:w="0"/>
+        <w:jc w:val="center"/>
+        <w:tblLook w:firstColumn="1" w:firstRow="1" w:lastColumn="0" w:lastRow="0" w:noHBand="0" w:noVBand="1" w:val="04A0"/>
+      </w:tblPr>
+      <w:tblGrid>
+        <w:gridCol w:w="1805"/>
+        <w:gridCol w:w="1805"/>
+        <w:gridCol w:w="1805"/>
+        <w:gridCol w:w="1805"/>
+        <w:gridCol w:w="1805"/>
+      </w:tblGrid>
+      <w:tr>
+        <w:tc>
+          <w:tcPr>
+            <w:tcW w:type="dxa" w:w="2948"/>
+            <w:shd w:val="clear" w:color="auto" w:fill="E8EEF6"/>
+          </w:tcPr>
+          <w:p>
+            <w:pPr>
+              <w:spacing w:after="20"/>
+            </w:pPr>
+            <w:r/>
+            <w:r>
+              <w:rPr>
+                <w:b/>
+                <w:sz w:val="17"/>
+              </w:rPr>
+              <w:t>Superzone level, k = 20</w:t>
+            </w:r>
+          </w:p>
+        </w:tc>
+        <w:tc>
+          <w:tcPr>
+            <w:tcW w:type="dxa" w:w="2438"/>
+            <w:shd w:val="clear" w:color="auto" w:fill="E8EEF6"/>
+          </w:tcPr>
+          <w:p>
+            <w:pPr>
+              <w:spacing w:after="20"/>
+            </w:pPr>
+            <w:r/>
+            <w:r>
+              <w:rPr>
+                <w:b/>
+                <w:sz w:val="17"/>
+              </w:rPr>
+              <w:t>Car vs transit</w:t>
+            </w:r>
+          </w:p>
+        </w:tc>
+        <w:tc>
+          <w:tcPr>
+            <w:tcW w:type="dxa" w:w="1247"/>
+            <w:shd w:val="clear" w:color="auto" w:fill="E8EEF6"/>
+          </w:tcPr>
+          <w:p>
+            <w:pPr>
+              <w:spacing w:after="20"/>
+            </w:pPr>
+            <w:r/>
+            <w:r>
+              <w:rPr>
+                <w:b/>
+                <w:sz w:val="17"/>
+              </w:rPr>
+              <w:t>Car day-to-day</w:t>
+            </w:r>
+          </w:p>
+        </w:tc>
+        <w:tc>
+          <w:tcPr>
+            <w:tcW w:type="dxa" w:w="1474"/>
+            <w:shd w:val="clear" w:color="auto" w:fill="E8EEF6"/>
+          </w:tcPr>
+          <w:p>
+            <w:pPr>
+              <w:spacing w:after="20"/>
+            </w:pPr>
+            <w:r/>
+            <w:r>
+              <w:rPr>
+                <w:b/>
+                <w:sz w:val="17"/>
+              </w:rPr>
+              <w:t>Transit day-to-day</w:t>
+            </w:r>
+          </w:p>
+        </w:tc>
+        <w:tc>
+          <w:tcPr>
+            <w:tcW w:type="dxa" w:w="907"/>
+            <w:shd w:val="clear" w:color="auto" w:fill="E8EEF6"/>
+          </w:tcPr>
+          <w:p>
+            <w:pPr>
+              <w:spacing w:after="20"/>
+            </w:pPr>
+            <w:r/>
+            <w:r>
+              <w:rPr>
+                <w:b/>
+                <w:sz w:val="17"/>
+              </w:rPr>
+              <w:t>Chance</w:t>
+            </w:r>
+          </w:p>
+        </w:tc>
+      </w:tr>
+      <w:tr>
+        <w:tc>
+          <w:tcPr>
+            <w:tcW w:type="dxa" w:w="2948"/>
+          </w:tcPr>
+          <w:p>
+            <w:pPr>
+              <w:spacing w:after="20"/>
+            </w:pPr>
+            <w:r/>
+            <w:r>
+              <w:rPr>
+                <w:sz w:val="17"/>
+              </w:rPr>
+              <w:t>Subspace overlap</w:t>
+            </w:r>
+          </w:p>
+        </w:tc>
+        <w:tc>
+          <w:tcPr>
+            <w:tcW w:type="dxa" w:w="2438"/>
+          </w:tcPr>
+          <w:p>
+            <w:pPr>
+              <w:spacing w:after="20"/>
+              <w:jc w:val="right"/>
+            </w:pPr>
+            <w:r/>
+            <w:r>
+              <w:rPr>
+                <w:sz w:val="17"/>
+              </w:rPr>
+              <w:t>0.75 (bootstrap 0.66–0.76; p = 0.0005)</w:t>
+            </w:r>
+          </w:p>
+        </w:tc>
+        <w:tc>
+          <w:tcPr>
+            <w:tcW w:type="dxa" w:w="1247"/>
+          </w:tcPr>
+          <w:p>
+            <w:pPr>
+              <w:spacing w:after="20"/>
+              <w:jc w:val="right"/>
+            </w:pPr>
+            <w:r/>
+            <w:r>
+              <w:rPr>
+                <w:sz w:val="17"/>
+              </w:rPr>
+              <w:t>0.95</w:t>
+            </w:r>
+          </w:p>
+        </w:tc>
+        <w:tc>
+          <w:tcPr>
+            <w:tcW w:type="dxa" w:w="1474"/>
+          </w:tcPr>
+          <w:p>
+            <w:pPr>
+              <w:spacing w:after="20"/>
+              <w:jc w:val="right"/>
+            </w:pPr>
+            <w:r/>
+            <w:r>
+              <w:rPr>
+                <w:sz w:val="17"/>
+              </w:rPr>
+              <w:t>0.81</w:t>
+            </w:r>
+          </w:p>
+        </w:tc>
+        <w:tc>
+          <w:tcPr>
+            <w:tcW w:type="dxa" w:w="907"/>
+          </w:tcPr>
+          <w:p>
+            <w:pPr>
+              <w:spacing w:after="20"/>
+              <w:jc w:val="right"/>
+            </w:pPr>
+            <w:r/>
+            <w:r>
+              <w:rPr>
+                <w:sz w:val="17"/>
+              </w:rPr>
+              <w:t>0.57</w:t>
+            </w:r>
+          </w:p>
+        </w:tc>
+      </w:tr>
+      <w:tr>
+        <w:tc>
+          <w:tcPr>
+            <w:tcW w:type="dxa" w:w="2948"/>
+          </w:tcPr>
+          <w:p>
+            <w:pPr>
+              <w:spacing w:after="20"/>
+            </w:pPr>
+            <w:r/>
+            <w:r>
+              <w:rPr>
+                <w:sz w:val="17"/>
+              </w:rPr>
+              <w:t>Overlap on the 26 well-sampled origins</w:t>
+            </w:r>
+          </w:p>
+        </w:tc>
+        <w:tc>
+          <w:tcPr>
+            <w:tcW w:type="dxa" w:w="2438"/>
+          </w:tcPr>
+          <w:p>
+            <w:pPr>
+              <w:spacing w:after="20"/>
+              <w:jc w:val="right"/>
+            </w:pPr>
+            <w:r/>
+            <w:r>
+              <w:rPr>
+                <w:sz w:val="17"/>
+              </w:rPr>
+              <w:t>0.83</w:t>
+            </w:r>
+          </w:p>
+        </w:tc>
+        <w:tc>
+          <w:tcPr>
+            <w:tcW w:type="dxa" w:w="1247"/>
+          </w:tcPr>
+          <w:p>
+            <w:pPr>
+              <w:spacing w:after="20"/>
+              <w:jc w:val="right"/>
+            </w:pPr>
+            <w:r/>
+            <w:r>
+              <w:rPr>
+                <w:sz w:val="17"/>
+              </w:rPr>
+              <w:t>0.98</w:t>
+            </w:r>
+          </w:p>
+        </w:tc>
+        <w:tc>
+          <w:tcPr>
+            <w:tcW w:type="dxa" w:w="1474"/>
+          </w:tcPr>
+          <w:p>
+            <w:pPr>
+              <w:spacing w:after="20"/>
+              <w:jc w:val="right"/>
+            </w:pPr>
+            <w:r/>
+            <w:r>
+              <w:rPr>
+                <w:sz w:val="17"/>
+              </w:rPr>
+              <w:t>0.86</w:t>
+            </w:r>
+          </w:p>
+        </w:tc>
+        <w:tc>
+          <w:tcPr>
+            <w:tcW w:type="dxa" w:w="907"/>
+          </w:tcPr>
+          <w:p>
+            <w:pPr>
+              <w:spacing w:after="20"/>
+              <w:jc w:val="right"/>
+            </w:pPr>
+            <w:r/>
+            <w:r>
+              <w:rPr>
+                <w:sz w:val="17"/>
+              </w:rPr>
+            </w:r>
+          </w:p>
+        </w:tc>
+      </w:tr>
+      <w:tr>
+        <w:tc>
+          <w:tcPr>
+            <w:tcW w:type="dxa" w:w="2948"/>
+          </w:tcPr>
+          <w:p>
+            <w:pPr>
+              <w:spacing w:after="20"/>
+            </w:pPr>
+            <w:r/>
+            <w:r>
+              <w:rPr>
+                <w:sz w:val="17"/>
+              </w:rPr>
+              <w:t>Transit variance captured by car components</w:t>
+            </w:r>
+          </w:p>
+        </w:tc>
+        <w:tc>
+          <w:tcPr>
+            <w:tcW w:type="dxa" w:w="2438"/>
+          </w:tcPr>
+          <w:p>
+            <w:pPr>
+              <w:spacing w:after="20"/>
+              <w:jc w:val="right"/>
+            </w:pPr>
+            <w:r/>
+            <w:r>
+              <w:rPr>
+                <w:sz w:val="17"/>
+              </w:rPr>
+              <w:t>0.86</w:t>
+            </w:r>
+          </w:p>
+        </w:tc>
+        <w:tc>
+          <w:tcPr>
+            <w:tcW w:type="dxa" w:w="1247"/>
+          </w:tcPr>
+          <w:p>
+            <w:pPr>
+              <w:spacing w:after="20"/>
+              <w:jc w:val="right"/>
+            </w:pPr>
+            <w:r/>
+            <w:r>
+              <w:rPr>
+                <w:sz w:val="17"/>
+              </w:rPr>
+            </w:r>
+          </w:p>
+        </w:tc>
+        <w:tc>
+          <w:tcPr>
+            <w:tcW w:type="dxa" w:w="1474"/>
+          </w:tcPr>
+          <w:p>
+            <w:pPr>
+              <w:spacing w:after="20"/>
+              <w:jc w:val="right"/>
+            </w:pPr>
+            <w:r/>
+            <w:r>
+              <w:rPr>
+                <w:sz w:val="17"/>
+              </w:rPr>
+              <w:t>0.89 (by its own)</w:t>
+            </w:r>
+          </w:p>
+        </w:tc>
+        <w:tc>
+          <w:tcPr>
+            <w:tcW w:type="dxa" w:w="907"/>
+          </w:tcPr>
+          <w:p>
+            <w:pPr>
+              <w:spacing w:after="20"/>
+              <w:jc w:val="right"/>
+            </w:pPr>
+            <w:r/>
+            <w:r>
+              <w:rPr>
+                <w:sz w:val="17"/>
+              </w:rPr>
+            </w:r>
+          </w:p>
+        </w:tc>
+      </w:tr>
+      <w:tr>
+        <w:tc>
+          <w:tcPr>
+            <w:tcW w:type="dxa" w:w="2948"/>
+          </w:tcPr>
+          <w:p>
+            <w:pPr>
+              <w:spacing w:after="20"/>
+            </w:pPr>
+            <w:r/>
+            <w:r>
+              <w:rPr>
+                <w:sz w:val="17"/>
+              </w:rPr>
+              <w:t>Mean self-containment</w:t>
+            </w:r>
+          </w:p>
+        </w:tc>
+        <w:tc>
+          <w:tcPr>
+            <w:tcW w:type="dxa" w:w="2438"/>
+          </w:tcPr>
+          <w:p>
+            <w:pPr>
+              <w:spacing w:after="20"/>
+              <w:jc w:val="right"/>
+            </w:pPr>
+            <w:r/>
+            <w:r>
+              <w:rPr>
+                <w:sz w:val="17"/>
+              </w:rPr>
+              <w:t>car 0.62, transit 0.45</w:t>
+            </w:r>
+          </w:p>
+        </w:tc>
+        <w:tc>
+          <w:tcPr>
+            <w:tcW w:type="dxa" w:w="1247"/>
+          </w:tcPr>
+          <w:p>
+            <w:pPr>
+              <w:spacing w:after="20"/>
+              <w:jc w:val="right"/>
+            </w:pPr>
+            <w:r/>
+            <w:r>
+              <w:rPr>
+                <w:sz w:val="17"/>
+              </w:rPr>
+            </w:r>
+          </w:p>
+        </w:tc>
+        <w:tc>
+          <w:tcPr>
+            <w:tcW w:type="dxa" w:w="1474"/>
+          </w:tcPr>
+          <w:p>
+            <w:pPr>
+              <w:spacing w:after="20"/>
+              <w:jc w:val="right"/>
+            </w:pPr>
+            <w:r/>
+            <w:r>
+              <w:rPr>
+                <w:sz w:val="17"/>
+              </w:rPr>
+            </w:r>
+          </w:p>
+        </w:tc>
+        <w:tc>
+          <w:tcPr>
+            <w:tcW w:type="dxa" w:w="907"/>
+          </w:tcPr>
+          <w:p>
+            <w:pPr>
+              <w:spacing w:after="20"/>
+              <w:jc w:val="right"/>
+            </w:pPr>
+            <w:r/>
+            <w:r>
+              <w:rPr>
+                <w:sz w:val="17"/>
+              </w:rPr>
+            </w:r>
+          </w:p>
+        </w:tc>
+      </w:tr>
+      <w:tr>
+        <w:tc>
+          <w:tcPr>
+            <w:tcW w:type="dxa" w:w="2948"/>
+          </w:tcPr>
+          <w:p>
+            <w:pPr>
+              <w:spacing w:after="20"/>
+            </w:pPr>
+            <w:r/>
+            <w:r>
+              <w:rPr>
+                <w:sz w:val="17"/>
+              </w:rPr>
+              <w:t>Diagonal share of the divergence</w:t>
+            </w:r>
+          </w:p>
+        </w:tc>
+        <w:tc>
+          <w:tcPr>
+            <w:tcW w:type="dxa" w:w="2438"/>
+          </w:tcPr>
+          <w:p>
+            <w:pPr>
+              <w:spacing w:after="20"/>
+              <w:jc w:val="right"/>
+            </w:pPr>
+            <w:r/>
+            <w:r>
+              <w:rPr>
+                <w:sz w:val="17"/>
+              </w:rPr>
+              <w:t>0.44 (survey vs cellular: 0.87)</w:t>
+            </w:r>
+          </w:p>
+        </w:tc>
+        <w:tc>
+          <w:tcPr>
+            <w:tcW w:type="dxa" w:w="1247"/>
+          </w:tcPr>
+          <w:p>
+            <w:pPr>
+              <w:spacing w:after="20"/>
+              <w:jc w:val="right"/>
+            </w:pPr>
+            <w:r/>
+            <w:r>
+              <w:rPr>
+                <w:sz w:val="17"/>
+              </w:rPr>
+            </w:r>
+          </w:p>
+        </w:tc>
+        <w:tc>
+          <w:tcPr>
+            <w:tcW w:type="dxa" w:w="1474"/>
+          </w:tcPr>
+          <w:p>
+            <w:pPr>
+              <w:spacing w:after="20"/>
+              <w:jc w:val="right"/>
+            </w:pPr>
+            <w:r/>
+            <w:r>
+              <w:rPr>
+                <w:sz w:val="17"/>
+              </w:rPr>
+            </w:r>
+          </w:p>
+        </w:tc>
+        <w:tc>
+          <w:tcPr>
+            <w:tcW w:type="dxa" w:w="907"/>
+          </w:tcPr>
+          <w:p>
+            <w:pPr>
+              <w:spacing w:after="20"/>
+              <w:jc w:val="right"/>
+            </w:pPr>
+            <w:r/>
+            <w:r>
+              <w:rPr>
+                <w:sz w:val="17"/>
+              </w:rPr>
+            </w:r>
+          </w:p>
+        </w:tc>
+      </w:tr>
+      <w:tr>
+        <w:tc>
+          <w:tcPr>
+            <w:tcW w:type="dxa" w:w="2948"/>
+          </w:tcPr>
+          <w:p>
+            <w:pPr>
+              <w:spacing w:after="20"/>
+            </w:pPr>
+            <w:r/>
+            <w:r>
+              <w:rPr>
+                <w:sz w:val="17"/>
+              </w:rPr>
+              <w:t>Common direction of the divergence</w:t>
+            </w:r>
+          </w:p>
+        </w:tc>
+        <w:tc>
+          <w:tcPr>
+            <w:tcW w:type="dxa" w:w="2438"/>
+          </w:tcPr>
+          <w:p>
+            <w:pPr>
+              <w:spacing w:after="20"/>
+              <w:jc w:val="right"/>
+            </w:pPr>
+            <w:r/>
+            <w:r>
+              <w:rPr>
+                <w:sz w:val="17"/>
+              </w:rPr>
+              <w:t>yes, p = 0.04</w:t>
+            </w:r>
+          </w:p>
+        </w:tc>
+        <w:tc>
+          <w:tcPr>
+            <w:tcW w:type="dxa" w:w="1247"/>
+          </w:tcPr>
+          <w:p>
+            <w:pPr>
+              <w:spacing w:after="20"/>
+              <w:jc w:val="right"/>
+            </w:pPr>
+            <w:r/>
+            <w:r>
+              <w:rPr>
+                <w:sz w:val="17"/>
+              </w:rPr>
+            </w:r>
+          </w:p>
+        </w:tc>
+        <w:tc>
+          <w:tcPr>
+            <w:tcW w:type="dxa" w:w="1474"/>
+          </w:tcPr>
+          <w:p>
+            <w:pPr>
+              <w:spacing w:after="20"/>
+              <w:jc w:val="right"/>
+            </w:pPr>
+            <w:r/>
+            <w:r>
+              <w:rPr>
+                <w:sz w:val="17"/>
+              </w:rPr>
+            </w:r>
+          </w:p>
+        </w:tc>
+        <w:tc>
+          <w:tcPr>
+            <w:tcW w:type="dxa" w:w="907"/>
+          </w:tcPr>
+          <w:p>
+            <w:pPr>
+              <w:spacing w:after="20"/>
+              <w:jc w:val="right"/>
+            </w:pPr>
+            <w:r/>
+            <w:r>
+              <w:rPr>
+                <w:sz w:val="17"/>
+              </w:rPr>
+            </w:r>
+          </w:p>
+        </w:tc>
+      </w:tr>
+    </w:tbl>
+    <w:p>
+      <w:pPr>
+        <w:spacing w:after="40"/>
+      </w:pPr>
+    </w:p>
+    <w:p>
+      <w:r>
+        <w:rPr>
+          <w:i w:val="0"/>
+        </w:rPr>
+        <w:t>What it says: car and transit share the dominant structure. On the origins where transit is adequately sampled, the two modes agree with each other as closely as transit agrees with itself on another day, and the leading components match one to one (a geographic axis and a self-containment axis). Where they differ is systematic and points one way: transit trips are less local than car trips, and the released share goes to the Haifa core (Hadar, the Carmel centre, the lower city and the port areas gain two to three points of destination share on average; Tirat Carmel, Umm al-Fahm, Beit She'an and Ma'alot lose about two). The well-sampled origins where transit departs most from car are Rekhasim / Zevulun (45 % of transit trips to the Haifa superzones against 9 % of car trips), Shefa-'Amr / Tamra (66 % against 14 %) and Tirat Carmel (71 % against 23 %).</w:t>
+      </w:r>
+    </w:p>
+    <w:p>
+      <w:r>
+        <w:rPr>
+          <w:i w:val="0"/>
+        </w:rPr>
+        <w:t>Why it matters for the corridor: a transit market cannot be read off the car pattern by scaling. Transit demand from the outer superzones is markedly more Haifa-bound than car demand from the same places, which is the movement a Haifa-oriented line serves, and it is less local, so the intra-superzone trips that dominate the car matrix matter less for transit. This supports keeping a transit-specific destination pattern in the base, as the calibration in Part C does. At sub-area level the comparison is at transit's noise floor and says nothing; within Haifa, the on-board and ticketing products remain the right source.</w:t>
+      </w:r>
+    </w:p>
+    <w:p>
+      <w:pPr>
+        <w:jc w:val="center"/>
+      </w:pPr>
+      <w:r>
+        <w:drawing>
+          <wp:inline xmlns:a="http://schemas.openxmlformats.org/drawingml/2006/main" xmlns:pic="http://schemas.openxmlformats.org/drawingml/2006/picture">
+            <wp:extent cx="5724000" cy="2375902"/>
+            <wp:docPr id="5" name="Picture 5"/>
+            <wp:cNvGraphicFramePr>
+              <a:graphicFrameLocks noChangeAspect="1"/>
+            </wp:cNvGraphicFramePr>
+            <a:graphic>
+              <a:graphicData uri="http://schemas.openxmlformats.org/drawingml/2006/picture">
+                <pic:pic>
+                  <pic:nvPicPr>
+                    <pic:cNvPr id="0" name="pca_cvt_divergence.png"/>
+                    <pic:cNvPicPr/>
+                  </pic:nvPicPr>
+                  <pic:blipFill>
+                    <a:blip r:embed="rId13"/>
+                    <a:stretch>
+                      <a:fillRect/>
+                    </a:stretch>
+                  </pic:blipFill>
+                  <pic:spPr>
+                    <a:xfrm>
+                      <a:off x="0" y="0"/>
+                      <a:ext cx="5724000" cy="2375902"/>
+                    </a:xfrm>
+                    <a:prstGeom prst="rect"/>
+                  </pic:spPr>
+                </pic:pic>
+              </a:graphicData>
+            </a:graphic>
+          </wp:inline>
+        </w:drawing>
+      </w:r>
+    </w:p>
+    <w:p>
+      <w:r>
+        <w:rPr>
+          <w:i/>
+          <w:color w:val="52514E"/>
+          <w:sz w:val="18"/>
+        </w:rPr>
+        <w:t>Figure 4b. Left: joint component map, car (grey) and transit (blue) profiles of each origin superzone. Right: transit minus car destination shares; the Haifa-core columns are systematically positive.</w:t>
+      </w:r>
+    </w:p>
+    <w:p>
+      <w:pPr>
         <w:pStyle w:val="Heading1"/>
       </w:pPr>
       <w:r>
@@ -5161,7 +5893,7 @@
         <w:drawing>
           <wp:inline xmlns:a="http://schemas.openxmlformats.org/drawingml/2006/main" xmlns:pic="http://schemas.openxmlformats.org/drawingml/2006/picture">
             <wp:extent cx="4320000" cy="2569386"/>
-            <wp:docPr id="5" name="Picture 5"/>
+            <wp:docPr id="6" name="Picture 6"/>
             <wp:cNvGraphicFramePr>
               <a:graphicFrameLocks noChangeAspect="1"/>
             </wp:cNvGraphicFramePr>
@@ -5173,7 +5905,7 @@
                     <pic:cNvPicPr/>
                   </pic:nvPicPr>
                   <pic:blipFill>
-                    <a:blip r:embed="rId13"/>
+                    <a:blip r:embed="rId14"/>
                     <a:stretch>
                       <a:fillRect/>
                     </a:stretch>
@@ -8391,7 +9123,7 @@
         <w:drawing>
           <wp:inline xmlns:a="http://schemas.openxmlformats.org/drawingml/2006/main" xmlns:pic="http://schemas.openxmlformats.org/drawingml/2006/picture">
             <wp:extent cx="5724000" cy="2483683"/>
-            <wp:docPr id="6" name="Picture 6"/>
+            <wp:docPr id="7" name="Picture 7"/>
             <wp:cNvGraphicFramePr>
               <a:graphicFrameLocks noChangeAspect="1"/>
             </wp:cNvGraphicFramePr>
@@ -8403,7 +9135,7 @@
                     <pic:cNvPicPr/>
                   </pic:nvPicPr>
                   <pic:blipFill>
-                    <a:blip r:embed="rId14"/>
+                    <a:blip r:embed="rId15"/>
                     <a:stretch>
                       <a:fillRect/>
                     </a:stretch>
@@ -9747,7 +10479,7 @@
         <w:drawing>
           <wp:inline xmlns:a="http://schemas.openxmlformats.org/drawingml/2006/main" xmlns:pic="http://schemas.openxmlformats.org/drawingml/2006/picture">
             <wp:extent cx="5724000" cy="1961927"/>
-            <wp:docPr id="7" name="Picture 7"/>
+            <wp:docPr id="8" name="Picture 8"/>
             <wp:cNvGraphicFramePr>
               <a:graphicFrameLocks noChangeAspect="1"/>
             </wp:cNvGraphicFramePr>
@@ -9759,7 +10491,7 @@
                     <pic:cNvPicPr/>
                   </pic:nvPicPr>
                   <pic:blipFill>
-                    <a:blip r:embed="rId15"/>
+                    <a:blip r:embed="rId16"/>
                     <a:stretch>
                       <a:fillRect/>
                     </a:stretch>
@@ -10210,7 +10942,7 @@
         <w:drawing>
           <wp:inline xmlns:a="http://schemas.openxmlformats.org/drawingml/2006/main" xmlns:pic="http://schemas.openxmlformats.org/drawingml/2006/picture">
             <wp:extent cx="5724000" cy="1977285"/>
-            <wp:docPr id="8" name="Picture 8"/>
+            <wp:docPr id="9" name="Picture 9"/>
             <wp:cNvGraphicFramePr>
               <a:graphicFrameLocks noChangeAspect="1"/>
             </wp:cNvGraphicFramePr>
@@ -10222,7 +10954,7 @@
                     <pic:cNvPicPr/>
                   </pic:nvPicPr>
                   <pic:blipFill>
-                    <a:blip r:embed="rId16"/>
+                    <a:blip r:embed="rId17"/>
                     <a:stretch>
                       <a:fillRect/>
                     </a:stretch>
@@ -10291,7 +11023,7 @@
         <w:drawing>
           <wp:inline xmlns:a="http://schemas.openxmlformats.org/drawingml/2006/main" xmlns:pic="http://schemas.openxmlformats.org/drawingml/2006/picture">
             <wp:extent cx="5724000" cy="4207692"/>
-            <wp:docPr id="9" name="Picture 9"/>
+            <wp:docPr id="10" name="Picture 10"/>
             <wp:cNvGraphicFramePr>
               <a:graphicFrameLocks noChangeAspect="1"/>
             </wp:cNvGraphicFramePr>
@@ -10303,7 +11035,7 @@
                     <pic:cNvPicPr/>
                   </pic:nvPicPr>
                   <pic:blipFill>
-                    <a:blip r:embed="rId17"/>
+                    <a:blip r:embed="rId18"/>
                     <a:stretch>
                       <a:fillRect/>
                     </a:stretch>
@@ -11409,7 +12141,7 @@
         <w:drawing>
           <wp:inline xmlns:a="http://schemas.openxmlformats.org/drawingml/2006/main" xmlns:pic="http://schemas.openxmlformats.org/drawingml/2006/picture">
             <wp:extent cx="5724000" cy="4171772"/>
-            <wp:docPr id="10" name="Picture 10"/>
+            <wp:docPr id="11" name="Picture 11"/>
             <wp:cNvGraphicFramePr>
               <a:graphicFrameLocks noChangeAspect="1"/>
             </wp:cNvGraphicFramePr>
@@ -11421,7 +12153,7 @@
                     <pic:cNvPicPr/>
                   </pic:nvPicPr>
                   <pic:blipFill>
-                    <a:blip r:embed="rId18"/>
+                    <a:blip r:embed="rId19"/>
                     <a:stretch>
                       <a:fillRect/>
                     </a:stretch>
@@ -12175,6 +12907,59 @@
           </w:p>
         </w:tc>
       </w:tr>
+      <w:tr>
+        <w:tc>
+          <w:tcPr>
+            <w:tcW w:type="dxa" w:w="2608"/>
+          </w:tcPr>
+          <w:p>
+            <w:pPr>
+              <w:spacing w:after="20"/>
+            </w:pPr>
+            <w:r/>
+            <w:r>
+              <w:rPr>
+                <w:sz w:val="17"/>
+              </w:rPr>
+              <w:t>THS_2017_PCA_car_vs_transit.ipynb</w:t>
+            </w:r>
+          </w:p>
+        </w:tc>
+        <w:tc>
+          <w:tcPr>
+            <w:tcW w:type="dxa" w:w="2948"/>
+          </w:tcPr>
+          <w:p>
+            <w:pPr>
+              <w:spacing w:after="20"/>
+            </w:pPr>
+            <w:r/>
+            <w:r>
+              <w:rPr>
+                <w:sz w:val="17"/>
+              </w:rPr>
+              <w:t>PCA within the survey, car vs transit: overlap, cross-projection, component matching, divergence</w:t>
+            </w:r>
+          </w:p>
+        </w:tc>
+        <w:tc>
+          <w:tcPr>
+            <w:tcW w:type="dxa" w:w="3458"/>
+          </w:tcPr>
+          <w:p>
+            <w:pPr>
+              <w:spacing w:after="20"/>
+            </w:pPr>
+            <w:r/>
+            <w:r>
+              <w:rPr>
+                <w:sz w:val="17"/>
+              </w:rPr>
+              <w:t>Output/ths2017/tests/pca_car_vs_transit_*.csv</w:t>
+            </w:r>
+          </w:p>
+        </w:tc>
+      </w:tr>
     </w:tbl>
     <w:p>
       <w:pPr>
@@ -12186,7 +12971,7 @@
         <w:rPr>
           <w:i w:val="0"/>
         </w:rPr>
-        <w:t>Full method details, with every number, are in METHODOLOGY.md sections 6j to 6r of the repository; section 0 there lists every published file with its base, geography, modes, vintage and status.</w:t>
+        <w:t>Full method details, with every number, are in METHODOLOGY.md sections 6j to 6s of the repository; section 0 there lists every published file with its base, geography, modes, vintage and status.</w:t>
       </w:r>
     </w:p>
     <w:sectPr>

</xml_diff>

<commit_message>
Car vs transit PCA at the corridor aggregation areas and at TAZ level
The suite now runs at four resolutions with sample-size restrictions on the
transit side: 28 corridor areas (car vs transit 0.57 against transit's own
repeatability 0.65 - at the noise floor), TAZ origins x superzone destinations
(0.75 vs 0.89 on 133 TAZs, common direction p = 0.002 - the clearest evidence
that transit is less local and more Haifa-bound) and TAZ x TAZ (0.27 vs 0.55:
only the coarse geography is shared). Per-area table of transit vs car shares
to the Haifa line areas. METHODOLOGY 6s, README and report section 4.7 updated.

Co-Authored-By: Claude Fable 5.1 <noreply@anthropic.com>
Claude-Session: https://claude.ai/code/session_01ARu29NbW8AYpZqV8kqXTdF
</commit_message>
<xml_diff>
--- a/reports/Survey_Matrices_Car_Bus_Rail_Report.docx
+++ b/reports/Survey_Matrices_Car_Bus_Rail_Report.docx
@@ -5684,6 +5684,814 @@
         <w:rPr>
           <w:i w:val="0"/>
         </w:rPr>
+        <w:t>The same tests at other resolutions:</w:t>
+      </w:r>
+    </w:p>
+    <w:tbl>
+      <w:tblPr>
+        <w:tblStyle w:val="TableGrid"/>
+        <w:tblW w:type="auto" w:w="0"/>
+        <w:jc w:val="center"/>
+        <w:tblLook w:firstColumn="1" w:firstRow="1" w:lastColumn="0" w:lastRow="0" w:noHBand="0" w:noVBand="1" w:val="04A0"/>
+      </w:tblPr>
+      <w:tblGrid>
+        <w:gridCol w:w="1289"/>
+        <w:gridCol w:w="1289"/>
+        <w:gridCol w:w="1289"/>
+        <w:gridCol w:w="1289"/>
+        <w:gridCol w:w="1289"/>
+        <w:gridCol w:w="1289"/>
+        <w:gridCol w:w="1289"/>
+      </w:tblGrid>
+      <w:tr>
+        <w:tc>
+          <w:tcPr>
+            <w:tcW w:type="dxa" w:w="3175"/>
+            <w:shd w:val="clear" w:color="auto" w:fill="E8EEF6"/>
+          </w:tcPr>
+          <w:p>
+            <w:pPr>
+              <w:spacing w:after="20"/>
+            </w:pPr>
+            <w:r/>
+            <w:r>
+              <w:rPr>
+                <w:b/>
+                <w:sz w:val="17"/>
+              </w:rPr>
+              <w:t>Level (origins with at least n sampled transit trips)</w:t>
+            </w:r>
+          </w:p>
+        </w:tc>
+        <w:tc>
+          <w:tcPr>
+            <w:tcW w:type="dxa" w:w="850"/>
+            <w:shd w:val="clear" w:color="auto" w:fill="E8EEF6"/>
+          </w:tcPr>
+          <w:p>
+            <w:pPr>
+              <w:spacing w:after="20"/>
+            </w:pPr>
+            <w:r/>
+            <w:r>
+              <w:rPr>
+                <w:b/>
+                <w:sz w:val="17"/>
+              </w:rPr>
+              <w:t>Origins</w:t>
+            </w:r>
+          </w:p>
+        </w:tc>
+        <w:tc>
+          <w:tcPr>
+            <w:tcW w:type="dxa" w:w="567"/>
+            <w:shd w:val="clear" w:color="auto" w:fill="E8EEF6"/>
+          </w:tcPr>
+          <w:p>
+            <w:pPr>
+              <w:spacing w:after="20"/>
+            </w:pPr>
+            <w:r/>
+            <w:r>
+              <w:rPr>
+                <w:b/>
+                <w:sz w:val="17"/>
+              </w:rPr>
+              <w:t>k</w:t>
+            </w:r>
+          </w:p>
+        </w:tc>
+        <w:tc>
+          <w:tcPr>
+            <w:tcW w:type="dxa" w:w="1247"/>
+            <w:shd w:val="clear" w:color="auto" w:fill="E8EEF6"/>
+          </w:tcPr>
+          <w:p>
+            <w:pPr>
+              <w:spacing w:after="20"/>
+            </w:pPr>
+            <w:r/>
+            <w:r>
+              <w:rPr>
+                <w:b/>
+                <w:sz w:val="17"/>
+              </w:rPr>
+              <w:t>Car vs transit</w:t>
+            </w:r>
+          </w:p>
+        </w:tc>
+        <w:tc>
+          <w:tcPr>
+            <w:tcW w:type="dxa" w:w="1247"/>
+            <w:shd w:val="clear" w:color="auto" w:fill="E8EEF6"/>
+          </w:tcPr>
+          <w:p>
+            <w:pPr>
+              <w:spacing w:after="20"/>
+            </w:pPr>
+            <w:r/>
+            <w:r>
+              <w:rPr>
+                <w:b/>
+                <w:sz w:val="17"/>
+              </w:rPr>
+              <w:t>Car day-to-day</w:t>
+            </w:r>
+          </w:p>
+        </w:tc>
+        <w:tc>
+          <w:tcPr>
+            <w:tcW w:type="dxa" w:w="1361"/>
+            <w:shd w:val="clear" w:color="auto" w:fill="E8EEF6"/>
+          </w:tcPr>
+          <w:p>
+            <w:pPr>
+              <w:spacing w:after="20"/>
+            </w:pPr>
+            <w:r/>
+            <w:r>
+              <w:rPr>
+                <w:b/>
+                <w:sz w:val="17"/>
+              </w:rPr>
+              <w:t>Transit day-to-day</w:t>
+            </w:r>
+          </w:p>
+        </w:tc>
+        <w:tc>
+          <w:tcPr>
+            <w:tcW w:type="dxa" w:w="850"/>
+            <w:shd w:val="clear" w:color="auto" w:fill="E8EEF6"/>
+          </w:tcPr>
+          <w:p>
+            <w:pPr>
+              <w:spacing w:after="20"/>
+            </w:pPr>
+            <w:r/>
+            <w:r>
+              <w:rPr>
+                <w:b/>
+                <w:sz w:val="17"/>
+              </w:rPr>
+              <w:t>Chance</w:t>
+            </w:r>
+          </w:p>
+        </w:tc>
+      </w:tr>
+      <w:tr>
+        <w:tc>
+          <w:tcPr>
+            <w:tcW w:type="dxa" w:w="3175"/>
+          </w:tcPr>
+          <w:p>
+            <w:pPr>
+              <w:spacing w:after="20"/>
+            </w:pPr>
+            <w:r/>
+            <w:r>
+              <w:rPr>
+                <w:sz w:val="17"/>
+              </w:rPr>
+              <w:t>Superzone × superzone (1)</w:t>
+            </w:r>
+          </w:p>
+        </w:tc>
+        <w:tc>
+          <w:tcPr>
+            <w:tcW w:type="dxa" w:w="850"/>
+          </w:tcPr>
+          <w:p>
+            <w:pPr>
+              <w:spacing w:after="20"/>
+              <w:jc w:val="right"/>
+            </w:pPr>
+            <w:r/>
+            <w:r>
+              <w:rPr>
+                <w:sz w:val="17"/>
+              </w:rPr>
+              <w:t>35</w:t>
+            </w:r>
+          </w:p>
+        </w:tc>
+        <w:tc>
+          <w:tcPr>
+            <w:tcW w:type="dxa" w:w="567"/>
+          </w:tcPr>
+          <w:p>
+            <w:pPr>
+              <w:spacing w:after="20"/>
+              <w:jc w:val="right"/>
+            </w:pPr>
+            <w:r/>
+            <w:r>
+              <w:rPr>
+                <w:sz w:val="17"/>
+              </w:rPr>
+              <w:t>20</w:t>
+            </w:r>
+          </w:p>
+        </w:tc>
+        <w:tc>
+          <w:tcPr>
+            <w:tcW w:type="dxa" w:w="1247"/>
+          </w:tcPr>
+          <w:p>
+            <w:pPr>
+              <w:spacing w:after="20"/>
+              <w:jc w:val="right"/>
+            </w:pPr>
+            <w:r/>
+            <w:r>
+              <w:rPr>
+                <w:sz w:val="17"/>
+              </w:rPr>
+              <w:t>0.75</w:t>
+            </w:r>
+          </w:p>
+        </w:tc>
+        <w:tc>
+          <w:tcPr>
+            <w:tcW w:type="dxa" w:w="1247"/>
+          </w:tcPr>
+          <w:p>
+            <w:pPr>
+              <w:spacing w:after="20"/>
+              <w:jc w:val="right"/>
+            </w:pPr>
+            <w:r/>
+            <w:r>
+              <w:rPr>
+                <w:sz w:val="17"/>
+              </w:rPr>
+              <w:t>0.95</w:t>
+            </w:r>
+          </w:p>
+        </w:tc>
+        <w:tc>
+          <w:tcPr>
+            <w:tcW w:type="dxa" w:w="1361"/>
+          </w:tcPr>
+          <w:p>
+            <w:pPr>
+              <w:spacing w:after="20"/>
+              <w:jc w:val="right"/>
+            </w:pPr>
+            <w:r/>
+            <w:r>
+              <w:rPr>
+                <w:sz w:val="17"/>
+              </w:rPr>
+              <w:t>0.81</w:t>
+            </w:r>
+          </w:p>
+        </w:tc>
+        <w:tc>
+          <w:tcPr>
+            <w:tcW w:type="dxa" w:w="850"/>
+          </w:tcPr>
+          <w:p>
+            <w:pPr>
+              <w:spacing w:after="20"/>
+              <w:jc w:val="right"/>
+            </w:pPr>
+            <w:r/>
+            <w:r>
+              <w:rPr>
+                <w:sz w:val="17"/>
+              </w:rPr>
+              <w:t>0.57</w:t>
+            </w:r>
+          </w:p>
+        </w:tc>
+      </w:tr>
+      <w:tr>
+        <w:tc>
+          <w:tcPr>
+            <w:tcW w:type="dxa" w:w="3175"/>
+          </w:tcPr>
+          <w:p>
+            <w:pPr>
+              <w:spacing w:after="20"/>
+            </w:pPr>
+            <w:r/>
+            <w:r>
+              <w:rPr>
+                <w:sz w:val="17"/>
+              </w:rPr>
+              <w:t>Corridor areas × areas (10)</w:t>
+            </w:r>
+          </w:p>
+        </w:tc>
+        <w:tc>
+          <w:tcPr>
+            <w:tcW w:type="dxa" w:w="850"/>
+          </w:tcPr>
+          <w:p>
+            <w:pPr>
+              <w:spacing w:after="20"/>
+              <w:jc w:val="right"/>
+            </w:pPr>
+            <w:r/>
+            <w:r>
+              <w:rPr>
+                <w:sz w:val="17"/>
+              </w:rPr>
+              <w:t>14</w:t>
+            </w:r>
+          </w:p>
+        </w:tc>
+        <w:tc>
+          <w:tcPr>
+            <w:tcW w:type="dxa" w:w="567"/>
+          </w:tcPr>
+          <w:p>
+            <w:pPr>
+              <w:spacing w:after="20"/>
+              <w:jc w:val="right"/>
+            </w:pPr>
+            <w:r/>
+            <w:r>
+              <w:rPr>
+                <w:sz w:val="17"/>
+              </w:rPr>
+              <w:t>5</w:t>
+            </w:r>
+          </w:p>
+        </w:tc>
+        <w:tc>
+          <w:tcPr>
+            <w:tcW w:type="dxa" w:w="1247"/>
+          </w:tcPr>
+          <w:p>
+            <w:pPr>
+              <w:spacing w:after="20"/>
+              <w:jc w:val="right"/>
+            </w:pPr>
+            <w:r/>
+            <w:r>
+              <w:rPr>
+                <w:sz w:val="17"/>
+              </w:rPr>
+              <w:t>0.57</w:t>
+            </w:r>
+          </w:p>
+        </w:tc>
+        <w:tc>
+          <w:tcPr>
+            <w:tcW w:type="dxa" w:w="1247"/>
+          </w:tcPr>
+          <w:p>
+            <w:pPr>
+              <w:spacing w:after="20"/>
+              <w:jc w:val="right"/>
+            </w:pPr>
+            <w:r/>
+            <w:r>
+              <w:rPr>
+                <w:sz w:val="17"/>
+              </w:rPr>
+              <w:t>0.91</w:t>
+            </w:r>
+          </w:p>
+        </w:tc>
+        <w:tc>
+          <w:tcPr>
+            <w:tcW w:type="dxa" w:w="1361"/>
+          </w:tcPr>
+          <w:p>
+            <w:pPr>
+              <w:spacing w:after="20"/>
+              <w:jc w:val="right"/>
+            </w:pPr>
+            <w:r/>
+            <w:r>
+              <w:rPr>
+                <w:sz w:val="17"/>
+              </w:rPr>
+              <w:t>0.65</w:t>
+            </w:r>
+          </w:p>
+        </w:tc>
+        <w:tc>
+          <w:tcPr>
+            <w:tcW w:type="dxa" w:w="850"/>
+          </w:tcPr>
+          <w:p>
+            <w:pPr>
+              <w:spacing w:after="20"/>
+              <w:jc w:val="right"/>
+            </w:pPr>
+            <w:r/>
+            <w:r>
+              <w:rPr>
+                <w:sz w:val="17"/>
+              </w:rPr>
+              <w:t>0.18</w:t>
+            </w:r>
+          </w:p>
+        </w:tc>
+      </w:tr>
+      <w:tr>
+        <w:tc>
+          <w:tcPr>
+            <w:tcW w:type="dxa" w:w="3175"/>
+          </w:tcPr>
+          <w:p>
+            <w:pPr>
+              <w:spacing w:after="20"/>
+            </w:pPr>
+            <w:r/>
+            <w:r>
+              <w:rPr>
+                <w:sz w:val="17"/>
+              </w:rPr>
+              <w:t>Corridor areas × areas (20)</w:t>
+            </w:r>
+          </w:p>
+        </w:tc>
+        <w:tc>
+          <w:tcPr>
+            <w:tcW w:type="dxa" w:w="850"/>
+          </w:tcPr>
+          <w:p>
+            <w:pPr>
+              <w:spacing w:after="20"/>
+              <w:jc w:val="right"/>
+            </w:pPr>
+            <w:r/>
+            <w:r>
+              <w:rPr>
+                <w:sz w:val="17"/>
+              </w:rPr>
+              <w:t>8</w:t>
+            </w:r>
+          </w:p>
+        </w:tc>
+        <w:tc>
+          <w:tcPr>
+            <w:tcW w:type="dxa" w:w="567"/>
+          </w:tcPr>
+          <w:p>
+            <w:pPr>
+              <w:spacing w:after="20"/>
+              <w:jc w:val="right"/>
+            </w:pPr>
+            <w:r/>
+            <w:r>
+              <w:rPr>
+                <w:sz w:val="17"/>
+              </w:rPr>
+              <w:t>3</w:t>
+            </w:r>
+          </w:p>
+        </w:tc>
+        <w:tc>
+          <w:tcPr>
+            <w:tcW w:type="dxa" w:w="1247"/>
+          </w:tcPr>
+          <w:p>
+            <w:pPr>
+              <w:spacing w:after="20"/>
+              <w:jc w:val="right"/>
+            </w:pPr>
+            <w:r/>
+            <w:r>
+              <w:rPr>
+                <w:sz w:val="17"/>
+              </w:rPr>
+              <w:t>0.64</w:t>
+            </w:r>
+          </w:p>
+        </w:tc>
+        <w:tc>
+          <w:tcPr>
+            <w:tcW w:type="dxa" w:w="1247"/>
+          </w:tcPr>
+          <w:p>
+            <w:pPr>
+              <w:spacing w:after="20"/>
+              <w:jc w:val="right"/>
+            </w:pPr>
+            <w:r/>
+            <w:r>
+              <w:rPr>
+                <w:sz w:val="17"/>
+              </w:rPr>
+              <w:t>0.99</w:t>
+            </w:r>
+          </w:p>
+        </w:tc>
+        <w:tc>
+          <w:tcPr>
+            <w:tcW w:type="dxa" w:w="1361"/>
+          </w:tcPr>
+          <w:p>
+            <w:pPr>
+              <w:spacing w:after="20"/>
+              <w:jc w:val="right"/>
+            </w:pPr>
+            <w:r/>
+            <w:r>
+              <w:rPr>
+                <w:sz w:val="17"/>
+              </w:rPr>
+              <w:t>0.70</w:t>
+            </w:r>
+          </w:p>
+        </w:tc>
+        <w:tc>
+          <w:tcPr>
+            <w:tcW w:type="dxa" w:w="850"/>
+          </w:tcPr>
+          <w:p>
+            <w:pPr>
+              <w:spacing w:after="20"/>
+              <w:jc w:val="right"/>
+            </w:pPr>
+            <w:r/>
+            <w:r>
+              <w:rPr>
+                <w:sz w:val="17"/>
+              </w:rPr>
+              <w:t>0.11</w:t>
+            </w:r>
+          </w:p>
+        </w:tc>
+      </w:tr>
+      <w:tr>
+        <w:tc>
+          <w:tcPr>
+            <w:tcW w:type="dxa" w:w="3175"/>
+          </w:tcPr>
+          <w:p>
+            <w:pPr>
+              <w:spacing w:after="20"/>
+            </w:pPr>
+            <w:r/>
+            <w:r>
+              <w:rPr>
+                <w:sz w:val="17"/>
+              </w:rPr>
+              <w:t>TAZ × superzone (5)</w:t>
+            </w:r>
+          </w:p>
+        </w:tc>
+        <w:tc>
+          <w:tcPr>
+            <w:tcW w:type="dxa" w:w="850"/>
+          </w:tcPr>
+          <w:p>
+            <w:pPr>
+              <w:spacing w:after="20"/>
+              <w:jc w:val="right"/>
+            </w:pPr>
+            <w:r/>
+            <w:r>
+              <w:rPr>
+                <w:sz w:val="17"/>
+              </w:rPr>
+              <w:t>133</w:t>
+            </w:r>
+          </w:p>
+        </w:tc>
+        <w:tc>
+          <w:tcPr>
+            <w:tcW w:type="dxa" w:w="567"/>
+          </w:tcPr>
+          <w:p>
+            <w:pPr>
+              <w:spacing w:after="20"/>
+              <w:jc w:val="right"/>
+            </w:pPr>
+            <w:r/>
+            <w:r>
+              <w:rPr>
+                <w:sz w:val="17"/>
+              </w:rPr>
+              <w:t>15</w:t>
+            </w:r>
+          </w:p>
+        </w:tc>
+        <w:tc>
+          <w:tcPr>
+            <w:tcW w:type="dxa" w:w="1247"/>
+          </w:tcPr>
+          <w:p>
+            <w:pPr>
+              <w:spacing w:after="20"/>
+              <w:jc w:val="right"/>
+            </w:pPr>
+            <w:r/>
+            <w:r>
+              <w:rPr>
+                <w:sz w:val="17"/>
+              </w:rPr>
+              <w:t>0.75</w:t>
+            </w:r>
+          </w:p>
+        </w:tc>
+        <w:tc>
+          <w:tcPr>
+            <w:tcW w:type="dxa" w:w="1247"/>
+          </w:tcPr>
+          <w:p>
+            <w:pPr>
+              <w:spacing w:after="20"/>
+              <w:jc w:val="right"/>
+            </w:pPr>
+            <w:r/>
+            <w:r>
+              <w:rPr>
+                <w:sz w:val="17"/>
+              </w:rPr>
+              <w:t>0.90</w:t>
+            </w:r>
+          </w:p>
+        </w:tc>
+        <w:tc>
+          <w:tcPr>
+            <w:tcW w:type="dxa" w:w="1361"/>
+          </w:tcPr>
+          <w:p>
+            <w:pPr>
+              <w:spacing w:after="20"/>
+              <w:jc w:val="right"/>
+            </w:pPr>
+            <w:r/>
+            <w:r>
+              <w:rPr>
+                <w:sz w:val="17"/>
+              </w:rPr>
+              <w:t>0.89</w:t>
+            </w:r>
+          </w:p>
+        </w:tc>
+        <w:tc>
+          <w:tcPr>
+            <w:tcW w:type="dxa" w:w="850"/>
+          </w:tcPr>
+          <w:p>
+            <w:pPr>
+              <w:spacing w:after="20"/>
+              <w:jc w:val="right"/>
+            </w:pPr>
+            <w:r/>
+            <w:r>
+              <w:rPr>
+                <w:sz w:val="17"/>
+              </w:rPr>
+              <w:t>0.43</w:t>
+            </w:r>
+          </w:p>
+        </w:tc>
+      </w:tr>
+      <w:tr>
+        <w:tc>
+          <w:tcPr>
+            <w:tcW w:type="dxa" w:w="3175"/>
+          </w:tcPr>
+          <w:p>
+            <w:pPr>
+              <w:spacing w:after="20"/>
+            </w:pPr>
+            <w:r/>
+            <w:r>
+              <w:rPr>
+                <w:sz w:val="17"/>
+              </w:rPr>
+              <w:t>TAZ × TAZ (5)</w:t>
+            </w:r>
+          </w:p>
+        </w:tc>
+        <w:tc>
+          <w:tcPr>
+            <w:tcW w:type="dxa" w:w="850"/>
+          </w:tcPr>
+          <w:p>
+            <w:pPr>
+              <w:spacing w:after="20"/>
+              <w:jc w:val="right"/>
+            </w:pPr>
+            <w:r/>
+            <w:r>
+              <w:rPr>
+                <w:sz w:val="17"/>
+              </w:rPr>
+              <w:t>133</w:t>
+            </w:r>
+          </w:p>
+        </w:tc>
+        <w:tc>
+          <w:tcPr>
+            <w:tcW w:type="dxa" w:w="567"/>
+          </w:tcPr>
+          <w:p>
+            <w:pPr>
+              <w:spacing w:after="20"/>
+              <w:jc w:val="right"/>
+            </w:pPr>
+            <w:r/>
+            <w:r>
+              <w:rPr>
+                <w:sz w:val="17"/>
+              </w:rPr>
+              <w:t>35</w:t>
+            </w:r>
+          </w:p>
+        </w:tc>
+        <w:tc>
+          <w:tcPr>
+            <w:tcW w:type="dxa" w:w="1247"/>
+          </w:tcPr>
+          <w:p>
+            <w:pPr>
+              <w:spacing w:after="20"/>
+              <w:jc w:val="right"/>
+            </w:pPr>
+            <w:r/>
+            <w:r>
+              <w:rPr>
+                <w:sz w:val="17"/>
+              </w:rPr>
+              <w:t>0.27</w:t>
+            </w:r>
+          </w:p>
+        </w:tc>
+        <w:tc>
+          <w:tcPr>
+            <w:tcW w:type="dxa" w:w="1247"/>
+          </w:tcPr>
+          <w:p>
+            <w:pPr>
+              <w:spacing w:after="20"/>
+              <w:jc w:val="right"/>
+            </w:pPr>
+            <w:r/>
+            <w:r>
+              <w:rPr>
+                <w:sz w:val="17"/>
+              </w:rPr>
+              <w:t>0.71</w:t>
+            </w:r>
+          </w:p>
+        </w:tc>
+        <w:tc>
+          <w:tcPr>
+            <w:tcW w:type="dxa" w:w="1361"/>
+          </w:tcPr>
+          <w:p>
+            <w:pPr>
+              <w:spacing w:after="20"/>
+              <w:jc w:val="right"/>
+            </w:pPr>
+            <w:r/>
+            <w:r>
+              <w:rPr>
+                <w:sz w:val="17"/>
+              </w:rPr>
+              <w:t>0.55</w:t>
+            </w:r>
+          </w:p>
+        </w:tc>
+        <w:tc>
+          <w:tcPr>
+            <w:tcW w:type="dxa" w:w="850"/>
+          </w:tcPr>
+          <w:p>
+            <w:pPr>
+              <w:spacing w:after="20"/>
+              <w:jc w:val="right"/>
+            </w:pPr>
+            <w:r/>
+            <w:r>
+              <w:rPr>
+                <w:sz w:val="17"/>
+              </w:rPr>
+              <w:t>0.05</w:t>
+            </w:r>
+          </w:p>
+        </w:tc>
+      </w:tr>
+    </w:tbl>
+    <w:p>
+      <w:pPr>
+        <w:spacing w:after="40"/>
+      </w:pPr>
+    </w:p>
+    <w:p>
+      <w:r>
+        <w:rPr>
+          <w:i w:val="0"/>
+        </w:rPr>
+        <w:t>At the corridor aggregation areas the modes are as alike as transit is to itself on another day: nothing finer can be resolved there from the survey. The well-sampled outer areas nevertheless show the Haifa pull plainly (Kiryat Motzkin-Bialik sends 26 % of its transit trips to the Haifa line areas against 6 % of its car trips; Kiryat Yam 13 % against 7 %; Kiryat Ata South 12 % against 3 %), while origins inside Haifa send 70–95 % of both modes there. With TAZ origins and superzone destinations, on the 133 TAZs with at least five sampled transit trips, the difference is statistically clear: car versus transit 0.75 against a transit repeatability of 0.89, with a common direction (p = 0.002). At full TAZ resolution only the coarse geography is shared (0.27 against a transit repeatability of 0.55): transit destinations follow stops and trunk routes, not the employment spread that places car trips, which is why the base takes transit destinations below superzone level from the on-board pattern rather than from a scaled car matrix.</w:t>
+      </w:r>
+    </w:p>
+    <w:p>
+      <w:r>
+        <w:rPr>
+          <w:i w:val="0"/>
+        </w:rPr>
         <w:t>Why it matters for the corridor: a transit market cannot be read off the car pattern by scaling. Transit demand from the outer superzones is markedly more Haifa-bound than car demand from the same places, which is the movement a Haifa-oriented line serves, and it is less local, so the intra-superzone trips that dominate the car matrix matter less for transit. This supports keeping a transit-specific destination pattern in the base, as the calibration in Part C does. At sub-area level the comparison is at transit's noise floor and says nothing; within Haifa, the on-board and ticketing products remain the right source.</w:t>
       </w:r>
     </w:p>
@@ -5694,7 +6502,7 @@
       <w:r>
         <w:drawing>
           <wp:inline xmlns:a="http://schemas.openxmlformats.org/drawingml/2006/main" xmlns:pic="http://schemas.openxmlformats.org/drawingml/2006/picture">
-            <wp:extent cx="5724000" cy="2375902"/>
+            <wp:extent cx="5724000" cy="2364092"/>
             <wp:docPr id="5" name="Picture 5"/>
             <wp:cNvGraphicFramePr>
               <a:graphicFrameLocks noChangeAspect="1"/>
@@ -5715,7 +6523,7 @@
                   <pic:spPr>
                     <a:xfrm>
                       <a:off x="0" y="0"/>
-                      <a:ext cx="5724000" cy="2375902"/>
+                      <a:ext cx="5724000" cy="2364092"/>
                     </a:xfrm>
                     <a:prstGeom prst="rect"/>
                   </pic:spPr>
@@ -5733,7 +6541,56 @@
           <w:color w:val="52514E"/>
           <w:sz w:val="18"/>
         </w:rPr>
-        <w:t>Figure 4b. Left: joint component map, car (grey) and transit (blue) profiles of each origin superzone. Right: transit minus car destination shares; the Haifa-core columns are systematically positive.</w:t>
+        <w:t>Figure 4b. Left: joint component map, car (grey) and transit (blue) profiles of each origin superzone; hollow markers are thin-sample origins. Right: transit minus car destination shares; the Haifa-core columns are systematically positive.</w:t>
+      </w:r>
+    </w:p>
+    <w:p>
+      <w:pPr>
+        <w:jc w:val="center"/>
+      </w:pPr>
+      <w:r>
+        <w:drawing>
+          <wp:inline xmlns:a="http://schemas.openxmlformats.org/drawingml/2006/main" xmlns:pic="http://schemas.openxmlformats.org/drawingml/2006/picture">
+            <wp:extent cx="5724000" cy="2096256"/>
+            <wp:docPr id="6" name="Picture 6"/>
+            <wp:cNvGraphicFramePr>
+              <a:graphicFrameLocks noChangeAspect="1"/>
+            </wp:cNvGraphicFramePr>
+            <a:graphic>
+              <a:graphicData uri="http://schemas.openxmlformats.org/drawingml/2006/picture">
+                <pic:pic>
+                  <pic:nvPicPr>
+                    <pic:cNvPr id="0" name="pca_cvt_levels.png"/>
+                    <pic:cNvPicPr/>
+                  </pic:nvPicPr>
+                  <pic:blipFill>
+                    <a:blip r:embed="rId14"/>
+                    <a:stretch>
+                      <a:fillRect/>
+                    </a:stretch>
+                  </pic:blipFill>
+                  <pic:spPr>
+                    <a:xfrm>
+                      <a:off x="0" y="0"/>
+                      <a:ext cx="5724000" cy="2096256"/>
+                    </a:xfrm>
+                    <a:prstGeom prst="rect"/>
+                  </pic:spPr>
+                </pic:pic>
+              </a:graphicData>
+            </a:graphic>
+          </wp:inline>
+        </w:drawing>
+      </w:r>
+    </w:p>
+    <w:p>
+      <w:r>
+        <w:rPr>
+          <w:i/>
+          <w:color w:val="52514E"/>
+          <w:sz w:val="18"/>
+        </w:rPr>
+        <w:t>Figure 4c. Left: overlap by resolution against each mode's repeatability and the permutation null. Right: transit minus car destination shares between the corridor aggregation areas.</w:t>
       </w:r>
     </w:p>
     <w:p>
@@ -5893,7 +6750,7 @@
         <w:drawing>
           <wp:inline xmlns:a="http://schemas.openxmlformats.org/drawingml/2006/main" xmlns:pic="http://schemas.openxmlformats.org/drawingml/2006/picture">
             <wp:extent cx="4320000" cy="2569386"/>
-            <wp:docPr id="6" name="Picture 6"/>
+            <wp:docPr id="7" name="Picture 7"/>
             <wp:cNvGraphicFramePr>
               <a:graphicFrameLocks noChangeAspect="1"/>
             </wp:cNvGraphicFramePr>
@@ -5905,7 +6762,7 @@
                     <pic:cNvPicPr/>
                   </pic:nvPicPr>
                   <pic:blipFill>
-                    <a:blip r:embed="rId14"/>
+                    <a:blip r:embed="rId15"/>
                     <a:stretch>
                       <a:fillRect/>
                     </a:stretch>
@@ -9123,7 +9980,7 @@
         <w:drawing>
           <wp:inline xmlns:a="http://schemas.openxmlformats.org/drawingml/2006/main" xmlns:pic="http://schemas.openxmlformats.org/drawingml/2006/picture">
             <wp:extent cx="5724000" cy="2483683"/>
-            <wp:docPr id="7" name="Picture 7"/>
+            <wp:docPr id="8" name="Picture 8"/>
             <wp:cNvGraphicFramePr>
               <a:graphicFrameLocks noChangeAspect="1"/>
             </wp:cNvGraphicFramePr>
@@ -9135,7 +9992,7 @@
                     <pic:cNvPicPr/>
                   </pic:nvPicPr>
                   <pic:blipFill>
-                    <a:blip r:embed="rId15"/>
+                    <a:blip r:embed="rId16"/>
                     <a:stretch>
                       <a:fillRect/>
                     </a:stretch>
@@ -10479,7 +11336,7 @@
         <w:drawing>
           <wp:inline xmlns:a="http://schemas.openxmlformats.org/drawingml/2006/main" xmlns:pic="http://schemas.openxmlformats.org/drawingml/2006/picture">
             <wp:extent cx="5724000" cy="1961927"/>
-            <wp:docPr id="8" name="Picture 8"/>
+            <wp:docPr id="9" name="Picture 9"/>
             <wp:cNvGraphicFramePr>
               <a:graphicFrameLocks noChangeAspect="1"/>
             </wp:cNvGraphicFramePr>
@@ -10491,7 +11348,7 @@
                     <pic:cNvPicPr/>
                   </pic:nvPicPr>
                   <pic:blipFill>
-                    <a:blip r:embed="rId16"/>
+                    <a:blip r:embed="rId17"/>
                     <a:stretch>
                       <a:fillRect/>
                     </a:stretch>
@@ -10942,7 +11799,7 @@
         <w:drawing>
           <wp:inline xmlns:a="http://schemas.openxmlformats.org/drawingml/2006/main" xmlns:pic="http://schemas.openxmlformats.org/drawingml/2006/picture">
             <wp:extent cx="5724000" cy="1977285"/>
-            <wp:docPr id="9" name="Picture 9"/>
+            <wp:docPr id="10" name="Picture 10"/>
             <wp:cNvGraphicFramePr>
               <a:graphicFrameLocks noChangeAspect="1"/>
             </wp:cNvGraphicFramePr>
@@ -10954,7 +11811,7 @@
                     <pic:cNvPicPr/>
                   </pic:nvPicPr>
                   <pic:blipFill>
-                    <a:blip r:embed="rId17"/>
+                    <a:blip r:embed="rId18"/>
                     <a:stretch>
                       <a:fillRect/>
                     </a:stretch>
@@ -11023,7 +11880,7 @@
         <w:drawing>
           <wp:inline xmlns:a="http://schemas.openxmlformats.org/drawingml/2006/main" xmlns:pic="http://schemas.openxmlformats.org/drawingml/2006/picture">
             <wp:extent cx="5724000" cy="4207692"/>
-            <wp:docPr id="10" name="Picture 10"/>
+            <wp:docPr id="11" name="Picture 11"/>
             <wp:cNvGraphicFramePr>
               <a:graphicFrameLocks noChangeAspect="1"/>
             </wp:cNvGraphicFramePr>
@@ -11035,7 +11892,7 @@
                     <pic:cNvPicPr/>
                   </pic:nvPicPr>
                   <pic:blipFill>
-                    <a:blip r:embed="rId18"/>
+                    <a:blip r:embed="rId19"/>
                     <a:stretch>
                       <a:fillRect/>
                     </a:stretch>
@@ -12141,7 +12998,7 @@
         <w:drawing>
           <wp:inline xmlns:a="http://schemas.openxmlformats.org/drawingml/2006/main" xmlns:pic="http://schemas.openxmlformats.org/drawingml/2006/picture">
             <wp:extent cx="5724000" cy="4171772"/>
-            <wp:docPr id="11" name="Picture 11"/>
+            <wp:docPr id="12" name="Picture 12"/>
             <wp:cNvGraphicFramePr>
               <a:graphicFrameLocks noChangeAspect="1"/>
             </wp:cNvGraphicFramePr>
@@ -12153,7 +13010,7 @@
                     <pic:cNvPicPr/>
                   </pic:nvPicPr>
                   <pic:blipFill>
-                    <a:blip r:embed="rId19"/>
+                    <a:blip r:embed="rId20"/>
                     <a:stretch>
                       <a:fillRect/>
                     </a:stretch>
@@ -12955,7 +13812,7 @@
               <w:rPr>
                 <w:sz w:val="17"/>
               </w:rPr>
-              <w:t>Output/ths2017/tests/pca_car_vs_transit_*.csv</w:t>
+              <w:t>Output/ths2017/tests/pca_car_vs_transit_*.csv (superzone, corridor areas, TAZ)</w:t>
             </w:r>
           </w:p>
         </w:tc>

</xml_diff>

<commit_message>
Carry the car-vs-transit findings into the conclusions, the README and the report's row-by-row reading
Co-Authored-By: Claude Fable 5.1 <noreply@anthropic.com>
Claude-Session: https://claude.ai/code/session_01ARu29NbW8AYpZqV8kqXTdF
</commit_message>
<xml_diff>
--- a/reports/Survey_Matrices_Car_Bus_Rail_Report.docx
+++ b/reports/Survey_Matrices_Car_Bus_Rail_Report.docx
@@ -6484,6 +6484,99 @@
         <w:rPr>
           <w:i w:val="0"/>
         </w:rPr>
+        <w:t>Reading the table row by row. Each row asks the same question at one map resolution: how much of the way car trips choose destinations do transit trips share? The answer is the 'car vs transit' number, and it only means something next to its two neighbours: 'transit day-to-day' is how well transit agrees with itself when the same households are asked on a second day (the best any comparison with transit can do at that resolution), and 'chance' is what unrelated matrices would score. When car vs transit is close to transit day-to-day, the two modes are as alike as the data can show; when it sits well below, transit really is different; when transit day-to-day itself is low, the resolution is too fine for the transit sample.</w:t>
+      </w:r>
+    </w:p>
+    <w:p>
+      <w:pPr>
+        <w:pStyle w:val="ListBullet"/>
+      </w:pPr>
+      <w:r>
+        <w:rPr>
+          <w:b/>
+        </w:rPr>
+        <w:t xml:space="preserve">Superzone × superzone. </w:t>
+      </w:r>
+      <w:r>
+        <w:rPr>
+          <w:i w:val="0"/>
+        </w:rPr>
+        <w:t>36 large zones. Car vs transit 0.75, transit day-to-day 0.81, chance 0.57. The modes share most of the structure, and the remaining gap is mostly the thin origins: on the 26 superzones with enough transit trips the two numbers are 0.83 and 0.86, effectively equal.</w:t>
+      </w:r>
+    </w:p>
+    <w:p>
+      <w:pPr>
+        <w:pStyle w:val="ListBullet"/>
+      </w:pPr>
+      <w:r>
+        <w:rPr>
+          <w:b/>
+        </w:rPr>
+        <w:t xml:space="preserve">Corridor areas, at least 10 sampled transit trips. </w:t>
+      </w:r>
+      <w:r>
+        <w:rPr>
+          <w:i w:val="0"/>
+        </w:rPr>
+        <w:t>14 of the 28 sub-areas around the line. Car vs transit 0.57, transit day-to-day 0.65, chance 0.18. Same reading, but transit's own repeatability has dropped to 0.65 because the areas are small and the transit sample per area is thin; the comparison is at the limit of what the survey can tell here.</w:t>
+      </w:r>
+    </w:p>
+    <w:p>
+      <w:pPr>
+        <w:pStyle w:val="ListBullet"/>
+      </w:pPr>
+      <w:r>
+        <w:rPr>
+          <w:b/>
+        </w:rPr>
+        <w:t xml:space="preserve">Corridor areas, at least 20 sampled transit trips. </w:t>
+      </w:r>
+      <w:r>
+        <w:rPr>
+          <w:i w:val="0"/>
+        </w:rPr>
+        <w:t>Only 8 areas qualify. Car vs transit 0.64, transit day-to-day 0.70. Better-sampled areas agree better, as expected, and again the modes are as alike as transit is to itself.</w:t>
+      </w:r>
+    </w:p>
+    <w:p>
+      <w:pPr>
+        <w:pStyle w:val="ListBullet"/>
+      </w:pPr>
+      <w:r>
+        <w:rPr>
+          <w:b/>
+        </w:rPr>
+        <w:t xml:space="preserve">TAZ origins, superzone destinations. </w:t>
+      </w:r>
+      <w:r>
+        <w:rPr>
+          <w:i w:val="0"/>
+        </w:rPr>
+        <w:t>133 TAZs with at least five transit trips, each described by where its trips go among the 36 superzones. Car vs transit 0.75 but transit day-to-day 0.89: here the gap is real, not sampling noise, and the test for a common direction confirms it. This is the row that establishes that transit is systematically less local and more Haifa-bound than car.</w:t>
+      </w:r>
+    </w:p>
+    <w:p>
+      <w:pPr>
+        <w:pStyle w:val="ListBullet"/>
+      </w:pPr>
+      <w:r>
+        <w:rPr>
+          <w:b/>
+        </w:rPr>
+        <w:t xml:space="preserve">TAZ × TAZ. </w:t>
+      </w:r>
+      <w:r>
+        <w:rPr>
+          <w:i w:val="0"/>
+        </w:rPr>
+        <w:t>The same 133 TAZs, described by where their trips go among all 778 TAZs. Car vs transit 0.27, transit day-to-day 0.55, chance 0.05. Both modes are noisy at this resolution, but even allowing for that, transit shares only the coarse geography with car: which TAZ within a superzone a transit trip ends in follows the bus stops and trunk routes, not the spread of jobs that places car trips.</w:t>
+      </w:r>
+    </w:p>
+    <w:p>
+      <w:r>
+        <w:rPr>
+          <w:i w:val="0"/>
+        </w:rPr>
         <w:t>At the corridor aggregation areas the modes are as alike as transit is to itself on another day: nothing finer can be resolved there from the survey. The well-sampled outer areas nevertheless show the Haifa pull plainly (Kiryat Motzkin-Bialik sends 26 % of its transit trips to the Haifa line areas against 6 % of its car trips; Kiryat Yam 13 % against 7 %; Kiryat Ata South 12 % against 3 %), while origins inside Haifa send 70–95 % of both modes there. With TAZ origins and superzone destinations, on the 133 TAZs with at least five sampled transit trips, the difference is statistically clear: car versus transit 0.75 against a transit repeatability of 0.89, with a common direction (p = 0.002). At full TAZ resolution only the coarse geography is shared (0.27 against a transit repeatability of 0.55): transit destinations follow stops and trunk routes, not the employment spread that places car trips, which is why the base takes transit destinations below superzone level from the on-board pattern rather than from a scaled car matrix.</w:t>
       </w:r>
     </w:p>
@@ -6551,7 +6644,7 @@
       <w:r>
         <w:drawing>
           <wp:inline xmlns:a="http://schemas.openxmlformats.org/drawingml/2006/main" xmlns:pic="http://schemas.openxmlformats.org/drawingml/2006/picture">
-            <wp:extent cx="5724000" cy="2096256"/>
+            <wp:extent cx="5724000" cy="2114108"/>
             <wp:docPr id="6" name="Picture 6"/>
             <wp:cNvGraphicFramePr>
               <a:graphicFrameLocks noChangeAspect="1"/>
@@ -6572,7 +6665,7 @@
                   <pic:spPr>
                     <a:xfrm>
                       <a:off x="0" y="0"/>
-                      <a:ext cx="5724000" cy="2096256"/>
+                      <a:ext cx="5724000" cy="2114108"/>
                     </a:xfrm>
                     <a:prstGeom prst="rect"/>
                   </pic:spPr>

</xml_diff>

<commit_message>
Step 35 rerun on the rebuilt products; plain-English Part 5 and report revision notes
The matrix tests now score the rebuilt calibrated bus layer against the 2025 ticketing
at cosine 0.87 / PCA overlap 0.87 at superzone level (0.59 / 0.60 with the OnBoard
pattern); section 6ag, 6af and the step 34 wording updated. docs/PLAIN_ENGLISH_METHODOLOGY.md
gains Part 5 (the corrections of 23 September in plain language, with the before / after
table); both reports under reports/ carry a dated revision note (2.2 and 1.4) with
before / after headline tables.

Co-Authored-By: Claude Fable 5.1 <noreply@anthropic.com>
Claude-Session: https://claude.ai/code/session_01XbUnSensyRAxEmKTSzJNuY
</commit_message>
<xml_diff>
--- a/reports/Survey_Matrices_Car_Bus_Rail_Report.docx
+++ b/reports/Survey_Matrices_Car_Bus_Rail_Report.docx
@@ -38,7 +38,7 @@
           <w:color w:val="52514E"/>
           <w:sz w:val="24"/>
         </w:rPr>
-        <w:t>Methodology, tests and results, in plain language — revision 2.1</w:t>
+        <w:t>Methodology, tests and results, in plain language — revision 2.2</w:t>
       </w:r>
     </w:p>
     <w:p>
@@ -50,7 +50,10 @@
           <w:i w:val="0"/>
           <w:sz w:val="20"/>
         </w:rPr>
-        <w:t>Date: 21 September 2026 (revision 1: 20 September 2026; revision 2.1 adds the peak-hour analysis, Part E section 7.3, and the car-versus-transit PCA, section 4.7)</w:t>
+        <w:t>Date: 23 September 2026 (revision 2.1: 21 September 2026; revision 1: 20 September 2026; revision 2.1 adds the peak-hour analysis, Part E section 7.3, and the car-versus-transit PCA, section 4.7)</w:t>
+      </w:r>
+      <w:r>
+        <w:t>; revision 2.2 (23 September 2026) adds the revision note below: the mode-code correction and the rebuild of the bus calibration on RavKav’s own alightings)</w:t>
       </w:r>
     </w:p>
     <w:p>
@@ -88,6 +91,634 @@
         <w:t>An external methodology review dated 21 September 2026 (Nofit_Demand_Methodology_Review.md in the repository) was assessed point by point and the work re-run where it was right. Four things changed: the ticketing coverage rule is applied per origin superzone and destination segment instead of per whole origin; taxi-type modes are a separate layer and no longer part of the bus matrix; the corridor profiles are labelled as three-hour potential movements rather than loads; and a new test shows that the earlier survey × cellular hybrid does not reproduce its own superzone totals, so the hybrid is now labelled historical. Every number below is the current one. Sections 4.1 to 4.5 (the similarity tests) are unchanged in substance, with the wording about the "day-to-day ceiling" corrected.</w:t>
       </w:r>
     </w:p>
+    <w:p>
+      <w:r>
+        <w:rPr>
+          <w:b/>
+        </w:rPr>
+        <w:t>What changed in revision 2.2.</w:t>
+      </w:r>
+      <w:r>
+        <w:t xml:space="preserve"> Two corrections were made on 23 September 2026 and every product under Output/ was rebuilt; the body of this report still reads at the 21 September state, and this note carries the current values. First, the survey’s mode codes 4 (group taxi) and 5 (Matronit) were found swapped in the chain, so the Matronit riders had been sitting in the taxi-type layer; the chain was rerun with the corrected codes. Second, the matrix tests were rerun on the rebuilt products together with new 2025 smart-card data, and they showed that the survey’s bus matrix shares the same destination structure as the raw RavKav journeys of 2022 (cosine 0.89, the same as between the survey’s own two days) but not the destination pattern of the on-board survey that Part C had been calibrating to (cosine 0.62, no better than chance). The bus calibration of Part C was therefore rebuilt with RavKav’s own inferred alightings as its ticketing reference. The held-out validation of section 5.3 now prefers the ticketing pattern outright (shrinkage constant k* 5 → 100); the survey-versus-ticketing gap of section 7.2 — the ticketing profile 2.5–3 times the survey towards Tirat Carmel — was the on-board pattern and is gone; the two sources now agree along the whole line to within 15 %, and only the Nazareth branch, where the two alighting inferences disagree by 13 times, still needs a count. Full account: METHODOLOGY.md §0 (“Rerun”, “Rebuild”), §6m, §6p, §6ag, and docs/PLAIN_ENGLISH_METHODOLOGY.md Part 5.</w:t>
+      </w:r>
+    </w:p>
+    <w:tbl>
+      <w:tblPr>
+        <w:tblStyle w:val="TableGrid"/>
+        <w:tblW w:type="auto" w:w="0"/>
+        <w:tblLook w:firstColumn="1" w:firstRow="1" w:lastColumn="0" w:lastRow="0" w:noHBand="0" w:noVBand="1" w:val="04A0"/>
+      </w:tblPr>
+      <w:tblGrid>
+        <w:gridCol w:w="2256"/>
+        <w:gridCol w:w="2256"/>
+        <w:gridCol w:w="2256"/>
+        <w:gridCol w:w="2256"/>
+      </w:tblGrid>
+      <w:tr>
+        <w:tc>
+          <w:tcPr>
+            <w:tcW w:type="dxa" w:w="2256"/>
+          </w:tcPr>
+          <w:p>
+            <w:r/>
+            <w:r>
+              <w:rPr>
+                <w:b/>
+              </w:rPr>
+              <w:t>Quantity</w:t>
+            </w:r>
+          </w:p>
+        </w:tc>
+        <w:tc>
+          <w:tcPr>
+            <w:tcW w:type="dxa" w:w="2256"/>
+          </w:tcPr>
+          <w:p>
+            <w:r/>
+            <w:r>
+              <w:rPr>
+                <w:b/>
+              </w:rPr>
+              <w:t>Revision 2.1 (21 Sep)</w:t>
+            </w:r>
+          </w:p>
+        </w:tc>
+        <w:tc>
+          <w:tcPr>
+            <w:tcW w:type="dxa" w:w="2256"/>
+          </w:tcPr>
+          <w:p>
+            <w:r/>
+            <w:r>
+              <w:rPr>
+                <w:b/>
+              </w:rPr>
+              <w:t>Corrected codes, on-board prior (23 Sep, morning)</w:t>
+            </w:r>
+          </w:p>
+        </w:tc>
+        <w:tc>
+          <w:tcPr>
+            <w:tcW w:type="dxa" w:w="2256"/>
+          </w:tcPr>
+          <w:p>
+            <w:r/>
+            <w:r>
+              <w:rPr>
+                <w:b/>
+              </w:rPr>
+              <w:t>Revision 2.2: corrected codes, RavKav’s own alightings (23 Sep)</w:t>
+            </w:r>
+          </w:p>
+        </w:tc>
+      </w:tr>
+      <w:tr>
+        <w:tc>
+          <w:tcPr>
+            <w:tcW w:type="dxa" w:w="2256"/>
+          </w:tcPr>
+          <w:p>
+            <w:r>
+              <w:t>Bus, 2018 base (calibrated)</w:t>
+            </w:r>
+          </w:p>
+        </w:tc>
+        <w:tc>
+          <w:tcPr>
+            <w:tcW w:type="dxa" w:w="2256"/>
+          </w:tcPr>
+          <w:p>
+            <w:r>
+              <w:t>126,117</w:t>
+            </w:r>
+          </w:p>
+        </w:tc>
+        <w:tc>
+          <w:tcPr>
+            <w:tcW w:type="dxa" w:w="2256"/>
+          </w:tcPr>
+          <w:p>
+            <w:r>
+              <w:t>125,439 survey → 127,185 calibrated</w:t>
+            </w:r>
+          </w:p>
+        </w:tc>
+        <w:tc>
+          <w:tcPr>
+            <w:tcW w:type="dxa" w:w="2256"/>
+          </w:tcPr>
+          <w:p>
+            <w:r>
+              <w:t>125,439 survey → 115,430 calibrated</w:t>
+            </w:r>
+          </w:p>
+        </w:tc>
+      </w:tr>
+      <w:tr>
+        <w:tc>
+          <w:tcPr>
+            <w:tcW w:type="dxa" w:w="2256"/>
+          </w:tcPr>
+          <w:p>
+            <w:r>
+              <w:t>Bus, 2022 base</w:t>
+            </w:r>
+          </w:p>
+        </w:tc>
+        <w:tc>
+          <w:tcPr>
+            <w:tcW w:type="dxa" w:w="2256"/>
+          </w:tcPr>
+          <w:p>
+            <w:r>
+              <w:t>129,653</w:t>
+            </w:r>
+          </w:p>
+        </w:tc>
+        <w:tc>
+          <w:tcPr>
+            <w:tcW w:type="dxa" w:w="2256"/>
+          </w:tcPr>
+          <w:p>
+            <w:r>
+              <w:t>130,779</w:t>
+            </w:r>
+          </w:p>
+        </w:tc>
+        <w:tc>
+          <w:tcPr>
+            <w:tcW w:type="dxa" w:w="2256"/>
+          </w:tcPr>
+          <w:p>
+            <w:r>
+              <w:t>117,961</w:t>
+            </w:r>
+          </w:p>
+        </w:tc>
+      </w:tr>
+      <w:tr>
+        <w:tc>
+          <w:tcPr>
+            <w:tcW w:type="dxa" w:w="2256"/>
+          </w:tcPr>
+          <w:p>
+            <w:r>
+              <w:t>Taxi-type, 2018 / 2022</w:t>
+            </w:r>
+          </w:p>
+        </w:tc>
+        <w:tc>
+          <w:tcPr>
+            <w:tcW w:type="dxa" w:w="2256"/>
+          </w:tcPr>
+          <w:p>
+            <w:r>
+              <w:t>18,266 / 19,359</w:t>
+            </w:r>
+          </w:p>
+        </w:tc>
+        <w:tc>
+          <w:tcPr>
+            <w:tcW w:type="dxa" w:w="2256"/>
+          </w:tcPr>
+          <w:p>
+            <w:r>
+              <w:t>8,910 / 9,451</w:t>
+            </w:r>
+          </w:p>
+        </w:tc>
+        <w:tc>
+          <w:tcPr>
+            <w:tcW w:type="dxa" w:w="2256"/>
+          </w:tcPr>
+          <w:p>
+            <w:r>
+              <w:t>8,910 / 9,451</w:t>
+            </w:r>
+          </w:p>
+        </w:tc>
+      </w:tr>
+      <w:tr>
+        <w:tc>
+          <w:tcPr>
+            <w:tcW w:type="dxa" w:w="2256"/>
+          </w:tcPr>
+          <w:p>
+            <w:r>
+              <w:t>Rail, 2018 / 2022</w:t>
+            </w:r>
+          </w:p>
+        </w:tc>
+        <w:tc>
+          <w:tcPr>
+            <w:tcW w:type="dxa" w:w="2256"/>
+          </w:tcPr>
+          <w:p>
+            <w:r>
+              <w:t>5,109 / 4,050</w:t>
+            </w:r>
+          </w:p>
+        </w:tc>
+        <w:tc>
+          <w:tcPr>
+            <w:tcW w:type="dxa" w:w="2256"/>
+          </w:tcPr>
+          <w:p>
+            <w:r>
+              <w:t>5,109 / 4,050</w:t>
+            </w:r>
+          </w:p>
+        </w:tc>
+        <w:tc>
+          <w:tcPr>
+            <w:tcW w:type="dxa" w:w="2256"/>
+          </w:tcPr>
+          <w:p>
+            <w:r>
+              <w:t>5,109 / 4,050</w:t>
+            </w:r>
+          </w:p>
+        </w:tc>
+      </w:tr>
+      <w:tr>
+        <w:tc>
+          <w:tcPr>
+            <w:tcW w:type="dxa" w:w="2256"/>
+          </w:tcPr>
+          <w:p>
+            <w:r>
+              <w:t>Transit (bus + rail) in the deliverable set, 2022</w:t>
+            </w:r>
+          </w:p>
+        </w:tc>
+        <w:tc>
+          <w:tcPr>
+            <w:tcW w:type="dxa" w:w="2256"/>
+          </w:tcPr>
+          <w:p>
+            <w:r>
+              <w:t>133,704</w:t>
+            </w:r>
+          </w:p>
+        </w:tc>
+        <w:tc>
+          <w:tcPr>
+            <w:tcW w:type="dxa" w:w="2256"/>
+          </w:tcPr>
+          <w:p>
+            <w:r>
+              <w:t>134,829</w:t>
+            </w:r>
+          </w:p>
+        </w:tc>
+        <w:tc>
+          <w:tcPr>
+            <w:tcW w:type="dxa" w:w="2256"/>
+          </w:tcPr>
+          <w:p>
+            <w:r>
+              <w:t>122,011</w:t>
+            </w:r>
+          </w:p>
+        </w:tc>
+      </w:tr>
+      <w:tr>
+        <w:tc>
+          <w:tcPr>
+            <w:tcW w:type="dxa" w:w="2256"/>
+          </w:tcPr>
+          <w:p>
+            <w:r>
+              <w:t>Bus share of car + bus + taxi + rail, 2022</w:t>
+            </w:r>
+          </w:p>
+        </w:tc>
+        <w:tc>
+          <w:tcPr>
+            <w:tcW w:type="dxa" w:w="2256"/>
+          </w:tcPr>
+          <w:p>
+            <w:r>
+              <w:t>8.6 %</w:t>
+            </w:r>
+          </w:p>
+        </w:tc>
+        <w:tc>
+          <w:tcPr>
+            <w:tcW w:type="dxa" w:w="2256"/>
+          </w:tcPr>
+          <w:p>
+            <w:r>
+              <w:t>8.7 %</w:t>
+            </w:r>
+          </w:p>
+        </w:tc>
+        <w:tc>
+          <w:tcPr>
+            <w:tcW w:type="dxa" w:w="2256"/>
+          </w:tcPr>
+          <w:p>
+            <w:r>
+              <w:t>7.9 %</w:t>
+            </w:r>
+          </w:p>
+        </w:tc>
+      </w:tr>
+      <w:tr>
+        <w:tc>
+          <w:tcPr>
+            <w:tcW w:type="dxa" w:w="2256"/>
+          </w:tcPr>
+          <w:p>
+            <w:r>
+              <w:t>Bus share, trips with both ends in the corridor, 2022</w:t>
+            </w:r>
+          </w:p>
+        </w:tc>
+        <w:tc>
+          <w:tcPr>
+            <w:tcW w:type="dxa" w:w="2256"/>
+          </w:tcPr>
+          <w:p>
+            <w:r>
+              <w:t>11.0 %</w:t>
+            </w:r>
+          </w:p>
+        </w:tc>
+        <w:tc>
+          <w:tcPr>
+            <w:tcW w:type="dxa" w:w="2256"/>
+          </w:tcPr>
+          <w:p>
+            <w:r>
+              <w:t>11.9 %</w:t>
+            </w:r>
+          </w:p>
+        </w:tc>
+        <w:tc>
+          <w:tcPr>
+            <w:tcW w:type="dxa" w:w="2256"/>
+          </w:tcPr>
+          <w:p>
+            <w:r>
+              <w:t>12.4 %</w:t>
+            </w:r>
+          </w:p>
+        </w:tc>
+      </w:tr>
+      <w:tr>
+        <w:tc>
+          <w:tcPr>
+            <w:tcW w:type="dxa" w:w="2256"/>
+          </w:tcPr>
+          <w:p>
+            <w:r>
+              <w:t>Guarded origin × segment cells (survey volume kept)</w:t>
+            </w:r>
+          </w:p>
+        </w:tc>
+        <w:tc>
+          <w:tcPr>
+            <w:tcW w:type="dxa" w:w="2256"/>
+          </w:tcPr>
+          <w:p>
+            <w:r>
+              <w:t>28</w:t>
+            </w:r>
+          </w:p>
+        </w:tc>
+        <w:tc>
+          <w:tcPr>
+            <w:tcW w:type="dxa" w:w="2256"/>
+          </w:tcPr>
+          <w:p>
+            <w:r>
+              <w:t>31</w:t>
+            </w:r>
+          </w:p>
+        </w:tc>
+        <w:tc>
+          <w:tcPr>
+            <w:tcW w:type="dxa" w:w="2256"/>
+          </w:tcPr>
+          <w:p>
+            <w:r>
+              <w:t>30</w:t>
+            </w:r>
+          </w:p>
+        </w:tc>
+      </w:tr>
+      <w:tr>
+        <w:tc>
+          <w:tcPr>
+            <w:tcW w:type="dxa" w:w="2256"/>
+          </w:tcPr>
+          <w:p>
+            <w:r>
+              <w:t>Held-out validation: pure ticketing rows vs survey rows (mean JSD, lower is better)</w:t>
+            </w:r>
+          </w:p>
+        </w:tc>
+        <w:tc>
+          <w:tcPr>
+            <w:tcW w:type="dxa" w:w="2256"/>
+          </w:tcPr>
+          <w:p>
+            <w:r>
+              <w:t>0.422 vs 0.340</w:t>
+            </w:r>
+          </w:p>
+        </w:tc>
+        <w:tc>
+          <w:tcPr>
+            <w:tcW w:type="dxa" w:w="2256"/>
+          </w:tcPr>
+          <w:p>
+            <w:r>
+              <w:t>0.422 vs 0.340</w:t>
+            </w:r>
+          </w:p>
+        </w:tc>
+        <w:tc>
+          <w:tcPr>
+            <w:tcW w:type="dxa" w:w="2256"/>
+          </w:tcPr>
+          <w:p>
+            <w:r>
+              <w:t>0.267 vs 0.336</w:t>
+            </w:r>
+          </w:p>
+        </w:tc>
+      </w:tr>
+      <w:tr>
+        <w:tc>
+          <w:tcPr>
+            <w:tcW w:type="dxa" w:w="2256"/>
+          </w:tcPr>
+          <w:p>
+            <w:r>
+              <w:t>Busiest transit link, three hours, towards Nazareth / Tirat Carmel</w:t>
+            </w:r>
+          </w:p>
+        </w:tc>
+        <w:tc>
+          <w:tcPr>
+            <w:tcW w:type="dxa" w:w="2256"/>
+          </w:tcPr>
+          <w:p>
+            <w:r>
+              <w:t>1,661 / 1,650</w:t>
+            </w:r>
+          </w:p>
+        </w:tc>
+        <w:tc>
+          <w:tcPr>
+            <w:tcW w:type="dxa" w:w="2256"/>
+          </w:tcPr>
+          <w:p>
+            <w:r>
+              <w:t>1,847 / 1,497</w:t>
+            </w:r>
+          </w:p>
+        </w:tc>
+        <w:tc>
+          <w:tcPr>
+            <w:tcW w:type="dxa" w:w="2256"/>
+          </w:tcPr>
+          <w:p>
+            <w:r>
+              <w:t>1,842 / 1,488</w:t>
+            </w:r>
+          </w:p>
+        </w:tc>
+      </w:tr>
+      <w:tr>
+        <w:tc>
+          <w:tcPr>
+            <w:tcW w:type="dxa" w:w="2256"/>
+          </w:tcPr>
+          <w:p>
+            <w:r>
+              <w:t>Survey ÷ ticketing over the Haifa segment, towards Nazareth / towards Tirat Carmel</w:t>
+            </w:r>
+          </w:p>
+        </w:tc>
+        <w:tc>
+          <w:tcPr>
+            <w:tcW w:type="dxa" w:w="2256"/>
+          </w:tcPr>
+          <w:p>
+            <w:r>
+              <w:t>0.87 / 0.60</w:t>
+            </w:r>
+          </w:p>
+        </w:tc>
+        <w:tc>
+          <w:tcPr>
+            <w:tcW w:type="dxa" w:w="2256"/>
+          </w:tcPr>
+          <w:p>
+            <w:r>
+              <w:t>0.97 / 0.60</w:t>
+            </w:r>
+          </w:p>
+        </w:tc>
+        <w:tc>
+          <w:tcPr>
+            <w:tcW w:type="dxa" w:w="2256"/>
+          </w:tcPr>
+          <w:p>
+            <w:r>
+              <w:t>1.06 / 0.97</w:t>
+            </w:r>
+          </w:p>
+        </w:tc>
+      </w:tr>
+      <w:tr>
+        <w:tc>
+          <w:tcPr>
+            <w:tcW w:type="dxa" w:w="2256"/>
+          </w:tcPr>
+          <w:p>
+            <w:r>
+              <w:t>Nazareth Area ticketed vs survey-based corridor trips towards Tirat Carmel</w:t>
+            </w:r>
+          </w:p>
+        </w:tc>
+        <w:tc>
+          <w:tcPr>
+            <w:tcW w:type="dxa" w:w="2256"/>
+          </w:tcPr>
+          <w:p>
+            <w:r>
+              <w:t>1,363 vs 445</w:t>
+            </w:r>
+          </w:p>
+        </w:tc>
+        <w:tc>
+          <w:tcPr>
+            <w:tcW w:type="dxa" w:w="2256"/>
+          </w:tcPr>
+          <w:p>
+            <w:r>
+              <w:t>1,363 vs 445</w:t>
+            </w:r>
+          </w:p>
+        </w:tc>
+        <w:tc>
+          <w:tcPr>
+            <w:tcW w:type="dxa" w:w="2256"/>
+          </w:tcPr>
+          <w:p>
+            <w:r>
+              <w:t>no longer a driver (207 vs 1,680 to the Haifa superzones)</w:t>
+            </w:r>
+          </w:p>
+        </w:tc>
+      </w:tr>
+      <w:tr>
+        <w:tc>
+          <w:tcPr>
+            <w:tcW w:type="dxa" w:w="2256"/>
+          </w:tcPr>
+          <w:p>
+            <w:r>
+              <w:t>Peak-hour transit potential movement, busiest link, towards Nazareth / Tirat Carmel</w:t>
+            </w:r>
+          </w:p>
+        </w:tc>
+        <w:tc>
+          <w:tcPr>
+            <w:tcW w:type="dxa" w:w="2256"/>
+          </w:tcPr>
+          <w:p>
+            <w:r>
+              <w:t>≈ 980</w:t>
+            </w:r>
+          </w:p>
+        </w:tc>
+        <w:tc>
+          <w:tcPr>
+            <w:tcW w:type="dxa" w:w="2256"/>
+          </w:tcPr>
+          <w:p>
+            <w:r>
+              <w:t>1,088 / 882</w:t>
+            </w:r>
+          </w:p>
+        </w:tc>
+        <w:tc>
+          <w:tcPr>
+            <w:tcW w:type="dxa" w:w="2256"/>
+          </w:tcPr>
+          <w:p>
+            <w:r>
+              <w:t>1,085 / 876</w:t>
+            </w:r>
+          </w:p>
+        </w:tc>
+      </w:tr>
+    </w:tbl>
     <w:p>
       <w:pPr>
         <w:pStyle w:val="Heading1"/>

</xml_diff>